<commit_message>
Acceptance Test and Criteria Document is updated
</commit_message>
<xml_diff>
--- a/Assignment4/Acceptance Test & Acceptance Criteria.docx
+++ b/Assignment4/Acceptance Test & Acceptance Criteria.docx
@@ -28,8 +28,6 @@
         </w:rPr>
         <w:t xml:space="preserve">1. UC1: User Registration </w:t>
       </w:r>
-      <w:bookmarkStart w:id="0" w:name="_GoBack"/>
-      <w:bookmarkEnd w:id="0"/>
     </w:p>
     <w:p>
       <w:pPr>
@@ -338,7 +336,27 @@
           <w:szCs w:val="24"/>
           <w:lang w:val="en-GB" w:eastAsia="tr-TR"/>
         </w:rPr>
-        <w:t xml:space="preserve"> The application redirects to the Home Screen, and the Firebase Authentication Console shows the new user entry.</w:t>
+        <w:t xml:space="preserve"> The application redirects to the </w:t>
+      </w:r>
+      <w:r>
+        <w:rPr>
+          <w:rFonts w:ascii="Times New Roman" w:eastAsia="Times New Roman" w:hAnsi="Times New Roman" w:cs="Times New Roman"/>
+          <w:color w:val="000000" w:themeColor="text1"/>
+          <w:sz w:val="24"/>
+          <w:szCs w:val="24"/>
+          <w:lang w:val="en-GB" w:eastAsia="tr-TR"/>
+        </w:rPr>
+        <w:t>Login</w:t>
+      </w:r>
+      <w:r>
+        <w:rPr>
+          <w:rFonts w:ascii="Times New Roman" w:eastAsia="Times New Roman" w:hAnsi="Times New Roman" w:cs="Times New Roman"/>
+          <w:color w:val="000000" w:themeColor="text1"/>
+          <w:sz w:val="24"/>
+          <w:szCs w:val="24"/>
+          <w:lang w:val="en-GB" w:eastAsia="tr-TR"/>
+        </w:rPr>
+        <w:t xml:space="preserve"> Screen, and the Firebase Authentication Console shows the new user entry.</w:t>
       </w:r>
     </w:p>
     <w:p>
@@ -611,7 +629,45 @@
           <w:szCs w:val="24"/>
           <w:lang w:val="en-GB" w:eastAsia="tr-TR"/>
         </w:rPr>
-        <w:t>Acceptance Test:</w:t>
+        <w:t>Acceptance Test</w:t>
+      </w:r>
+      <w:r>
+        <w:rPr>
+          <w:rFonts w:ascii="Times New Roman" w:eastAsia="Times New Roman" w:hAnsi="Times New Roman" w:cs="Times New Roman"/>
+          <w:b/>
+          <w:bCs/>
+          <w:color w:val="000000" w:themeColor="text1"/>
+          <w:sz w:val="24"/>
+          <w:szCs w:val="24"/>
+          <w:lang w:val="en-GB" w:eastAsia="tr-TR"/>
+        </w:rPr>
+        <w:t>(TC-01</w:t>
+      </w:r>
+      <w:bookmarkStart w:id="0" w:name="_GoBack"/>
+      <w:bookmarkEnd w:id="0"/>
+      <w:r>
+        <w:rPr>
+          <w:rFonts w:ascii="Times New Roman" w:eastAsia="Times New Roman" w:hAnsi="Times New Roman" w:cs="Times New Roman"/>
+          <w:b/>
+          <w:bCs/>
+          <w:color w:val="000000" w:themeColor="text1"/>
+          <w:sz w:val="24"/>
+          <w:szCs w:val="24"/>
+          <w:lang w:val="en-GB" w:eastAsia="tr-TR"/>
+        </w:rPr>
+        <w:t>)</w:t>
+      </w:r>
+      <w:r>
+        <w:rPr>
+          <w:rFonts w:ascii="Times New Roman" w:eastAsia="Times New Roman" w:hAnsi="Times New Roman" w:cs="Times New Roman"/>
+          <w:b/>
+          <w:bCs/>
+          <w:color w:val="000000" w:themeColor="text1"/>
+          <w:sz w:val="24"/>
+          <w:szCs w:val="24"/>
+          <w:lang w:val="en-GB" w:eastAsia="tr-TR"/>
+        </w:rPr>
+        <w:t>:</w:t>
       </w:r>
     </w:p>
     <w:p>
@@ -812,7 +868,7 @@
           <w:szCs w:val="24"/>
           <w:lang w:val="en-GB" w:eastAsia="tr-TR"/>
         </w:rPr>
-        <w:t xml:space="preserve"> to prevent client-side manipulation.</w:t>
+        <w:t xml:space="preserve"> </w:t>
       </w:r>
     </w:p>
     <w:p>
@@ -1240,7 +1296,7 @@
           <w:szCs w:val="24"/>
           <w:lang w:val="en-GB" w:eastAsia="tr-TR"/>
         </w:rPr>
-        <w:t xml:space="preserve"> (My Achievements) screen without requiring a manual page refresh.</w:t>
+        <w:t xml:space="preserve"> (My Achievements) screen.</w:t>
       </w:r>
     </w:p>
     <w:p>
@@ -1384,7 +1440,17 @@
           <w:szCs w:val="24"/>
           <w:lang w:val="en-GB" w:eastAsia="tr-TR"/>
         </w:rPr>
-        <w:t xml:space="preserve"> Navigate to the "My Achievements" screen after completing a survey.</w:t>
+        <w:t xml:space="preserve"> Navigate to the History Sc</w:t>
+      </w:r>
+      <w:r>
+        <w:rPr>
+          <w:rFonts w:ascii="Times New Roman" w:eastAsia="Times New Roman" w:hAnsi="Times New Roman" w:cs="Times New Roman"/>
+          <w:color w:val="000000" w:themeColor="text1"/>
+          <w:sz w:val="24"/>
+          <w:szCs w:val="24"/>
+          <w:lang w:val="en-GB" w:eastAsia="tr-TR"/>
+        </w:rPr>
+        <w:t>reen after completing a survey.</w:t>
       </w:r>
     </w:p>
     <w:p>

</xml_diff>

<commit_message>
Acceptance Test & Criteria Document is updated
</commit_message>
<xml_diff>
--- a/Assignment4/Acceptance Test & Acceptance Criteria.docx
+++ b/Assignment4/Acceptance Test & Acceptance Criteria.docx
@@ -5,9 +5,121 @@
     <w:p>
       <w:pPr>
         <w:spacing w:before="100" w:beforeAutospacing="1" w:after="100" w:afterAutospacing="1" w:line="240" w:lineRule="auto"/>
+        <w:jc w:val="center"/>
         <w:outlineLvl w:val="1"/>
         <w:rPr>
-          <w:rFonts w:ascii="Times New Roman" w:eastAsia="Times New Roman" w:hAnsi="Times New Roman" w:cs="Times New Roman"/>
+          <w:rFonts w:ascii="Aptos" w:eastAsia="Times New Roman" w:hAnsi="Aptos" w:cs="Times New Roman"/>
+          <w:b/>
+          <w:bCs/>
+          <w:color w:val="000000" w:themeColor="text1"/>
+          <w:sz w:val="44"/>
+          <w:szCs w:val="36"/>
+          <w:lang w:val="en-GB" w:eastAsia="tr-TR"/>
+        </w:rPr>
+      </w:pPr>
+      <w:r>
+        <w:rPr>
+          <w:rFonts w:ascii="Aptos" w:eastAsia="Times New Roman" w:hAnsi="Aptos" w:cs="Times New Roman"/>
+          <w:b/>
+          <w:bCs/>
+          <w:color w:val="000000" w:themeColor="text1"/>
+          <w:sz w:val="44"/>
+          <w:szCs w:val="36"/>
+          <w:lang w:val="en-GB" w:eastAsia="tr-TR"/>
+        </w:rPr>
+        <w:t>Acceptance Test</w:t>
+      </w:r>
+    </w:p>
+    <w:p>
+      <w:pPr>
+        <w:spacing w:before="100" w:beforeAutospacing="1" w:after="100" w:afterAutospacing="1" w:line="240" w:lineRule="auto"/>
+        <w:jc w:val="center"/>
+        <w:outlineLvl w:val="1"/>
+        <w:rPr>
+          <w:rFonts w:ascii="Aptos" w:eastAsia="Times New Roman" w:hAnsi="Aptos" w:cs="Times New Roman"/>
+          <w:b/>
+          <w:bCs/>
+          <w:color w:val="000000" w:themeColor="text1"/>
+          <w:sz w:val="44"/>
+          <w:szCs w:val="36"/>
+          <w:lang w:val="en-GB" w:eastAsia="tr-TR"/>
+        </w:rPr>
+      </w:pPr>
+      <w:r>
+        <w:rPr>
+          <w:rFonts w:ascii="Aptos" w:eastAsia="Times New Roman" w:hAnsi="Aptos" w:cs="Times New Roman"/>
+          <w:b/>
+          <w:bCs/>
+          <w:color w:val="000000" w:themeColor="text1"/>
+          <w:sz w:val="44"/>
+          <w:szCs w:val="36"/>
+          <w:lang w:val="en-GB" w:eastAsia="tr-TR"/>
+        </w:rPr>
+        <w:t>And</w:t>
+      </w:r>
+    </w:p>
+    <w:p>
+      <w:pPr>
+        <w:spacing w:before="100" w:beforeAutospacing="1" w:after="100" w:afterAutospacing="1" w:line="240" w:lineRule="auto"/>
+        <w:jc w:val="center"/>
+        <w:outlineLvl w:val="1"/>
+        <w:rPr>
+          <w:rFonts w:ascii="Aptos" w:eastAsia="Times New Roman" w:hAnsi="Aptos" w:cs="Times New Roman"/>
+          <w:b/>
+          <w:bCs/>
+          <w:color w:val="000000" w:themeColor="text1"/>
+          <w:sz w:val="44"/>
+          <w:szCs w:val="36"/>
+          <w:lang w:val="en-GB" w:eastAsia="tr-TR"/>
+        </w:rPr>
+      </w:pPr>
+      <w:r>
+        <w:rPr>
+          <w:rFonts w:ascii="Aptos" w:eastAsia="Times New Roman" w:hAnsi="Aptos" w:cs="Times New Roman"/>
+          <w:b/>
+          <w:bCs/>
+          <w:color w:val="000000" w:themeColor="text1"/>
+          <w:sz w:val="44"/>
+          <w:szCs w:val="36"/>
+          <w:lang w:val="en-GB" w:eastAsia="tr-TR"/>
+        </w:rPr>
+        <w:t xml:space="preserve"> Acceptance</w:t>
+      </w:r>
+    </w:p>
+    <w:p>
+      <w:pPr>
+        <w:spacing w:before="100" w:beforeAutospacing="1" w:after="100" w:afterAutospacing="1" w:line="240" w:lineRule="auto"/>
+        <w:jc w:val="center"/>
+        <w:outlineLvl w:val="1"/>
+        <w:rPr>
+          <w:rFonts w:ascii="Aptos" w:eastAsia="Times New Roman" w:hAnsi="Aptos" w:cs="Times New Roman"/>
+          <w:b/>
+          <w:bCs/>
+          <w:color w:val="000000" w:themeColor="text1"/>
+          <w:sz w:val="44"/>
+          <w:szCs w:val="36"/>
+          <w:lang w:val="en-GB" w:eastAsia="tr-TR"/>
+        </w:rPr>
+      </w:pPr>
+      <w:r>
+        <w:rPr>
+          <w:rFonts w:ascii="Aptos" w:eastAsia="Times New Roman" w:hAnsi="Aptos" w:cs="Times New Roman"/>
+          <w:b/>
+          <w:bCs/>
+          <w:color w:val="000000" w:themeColor="text1"/>
+          <w:sz w:val="44"/>
+          <w:szCs w:val="36"/>
+          <w:lang w:val="en-GB" w:eastAsia="tr-TR"/>
+        </w:rPr>
+        <w:t>Criteria Document</w:t>
+      </w:r>
+    </w:p>
+    <w:p>
+      <w:pPr>
+        <w:spacing w:before="100" w:beforeAutospacing="1" w:after="100" w:afterAutospacing="1" w:line="240" w:lineRule="auto"/>
+        <w:outlineLvl w:val="1"/>
+        <w:rPr>
+          <w:rFonts w:ascii="Aptos" w:eastAsia="Times New Roman" w:hAnsi="Aptos" w:cs="Times New Roman"/>
           <w:b/>
           <w:bCs/>
           <w:color w:val="000000" w:themeColor="text1"/>
@@ -16,9 +128,13 @@
           <w:lang w:val="en-GB" w:eastAsia="tr-TR"/>
         </w:rPr>
       </w:pPr>
-      <w:r>
-        <w:rPr>
-          <w:rFonts w:ascii="Times New Roman" w:eastAsia="Times New Roman" w:hAnsi="Times New Roman" w:cs="Times New Roman"/>
+    </w:p>
+    <w:p>
+      <w:pPr>
+        <w:spacing w:before="100" w:beforeAutospacing="1" w:after="100" w:afterAutospacing="1" w:line="240" w:lineRule="auto"/>
+        <w:outlineLvl w:val="1"/>
+        <w:rPr>
+          <w:rFonts w:ascii="Aptos" w:eastAsia="Times New Roman" w:hAnsi="Aptos" w:cs="Times New Roman"/>
           <w:b/>
           <w:bCs/>
           <w:color w:val="000000" w:themeColor="text1"/>
@@ -26,6 +142,1491 @@
           <w:szCs w:val="36"/>
           <w:lang w:val="en-GB" w:eastAsia="tr-TR"/>
         </w:rPr>
+      </w:pPr>
+    </w:p>
+    <w:p>
+      <w:pPr>
+        <w:spacing w:before="100" w:beforeAutospacing="1" w:after="100" w:afterAutospacing="1" w:line="240" w:lineRule="auto"/>
+        <w:outlineLvl w:val="1"/>
+        <w:rPr>
+          <w:rFonts w:ascii="Aptos" w:eastAsia="Times New Roman" w:hAnsi="Aptos" w:cs="Times New Roman"/>
+          <w:b/>
+          <w:bCs/>
+          <w:color w:val="000000" w:themeColor="text1"/>
+          <w:sz w:val="36"/>
+          <w:szCs w:val="36"/>
+          <w:lang w:val="en-GB" w:eastAsia="tr-TR"/>
+        </w:rPr>
+      </w:pPr>
+      <w:r>
+        <w:rPr>
+          <w:rFonts w:ascii="Aptos" w:eastAsia="Times New Roman" w:hAnsi="Aptos" w:cs="Times New Roman"/>
+          <w:b/>
+          <w:bCs/>
+          <w:color w:val="000000" w:themeColor="text1"/>
+          <w:sz w:val="36"/>
+          <w:szCs w:val="36"/>
+          <w:lang w:val="en-GB" w:eastAsia="tr-TR"/>
+        </w:rPr>
+        <w:t>Table of contents:</w:t>
+      </w:r>
+      <w:r>
+        <w:rPr>
+          <w:rFonts w:ascii="Aptos" w:eastAsia="Times New Roman" w:hAnsi="Aptos" w:cs="Times New Roman"/>
+          <w:b/>
+          <w:bCs/>
+          <w:color w:val="000000" w:themeColor="text1"/>
+          <w:sz w:val="36"/>
+          <w:szCs w:val="36"/>
+          <w:lang w:val="en-GB" w:eastAsia="tr-TR"/>
+        </w:rPr>
+        <w:br/>
+      </w:r>
+    </w:p>
+    <w:p>
+      <w:pPr>
+        <w:pStyle w:val="ListeParagraf"/>
+        <w:numPr>
+          <w:ilvl w:val="0"/>
+          <w:numId w:val="9"/>
+        </w:numPr>
+        <w:spacing w:before="100" w:beforeAutospacing="1" w:after="100" w:afterAutospacing="1" w:line="240" w:lineRule="auto"/>
+        <w:outlineLvl w:val="1"/>
+        <w:rPr>
+          <w:rFonts w:ascii="Aptos" w:eastAsia="Times New Roman" w:hAnsi="Aptos" w:cs="Times New Roman"/>
+          <w:b/>
+          <w:bCs/>
+          <w:color w:val="000000" w:themeColor="text1"/>
+          <w:sz w:val="36"/>
+          <w:szCs w:val="36"/>
+          <w:lang w:val="en-GB" w:eastAsia="tr-TR"/>
+        </w:rPr>
+      </w:pPr>
+      <w:r>
+        <w:rPr>
+          <w:rFonts w:ascii="Aptos" w:eastAsia="Times New Roman" w:hAnsi="Aptos" w:cs="Times New Roman"/>
+          <w:b/>
+          <w:bCs/>
+          <w:color w:val="000000" w:themeColor="text1"/>
+          <w:sz w:val="36"/>
+          <w:szCs w:val="36"/>
+          <w:lang w:val="en-GB" w:eastAsia="tr-TR"/>
+        </w:rPr>
+        <w:t>Introduction</w:t>
+      </w:r>
+    </w:p>
+    <w:p>
+      <w:pPr>
+        <w:pStyle w:val="ListeParagraf"/>
+        <w:numPr>
+          <w:ilvl w:val="0"/>
+          <w:numId w:val="9"/>
+        </w:numPr>
+        <w:spacing w:before="100" w:beforeAutospacing="1" w:after="100" w:afterAutospacing="1" w:line="240" w:lineRule="auto"/>
+        <w:outlineLvl w:val="1"/>
+        <w:rPr>
+          <w:rFonts w:ascii="Aptos" w:eastAsia="Times New Roman" w:hAnsi="Aptos" w:cs="Times New Roman"/>
+          <w:b/>
+          <w:bCs/>
+          <w:color w:val="000000" w:themeColor="text1"/>
+          <w:sz w:val="36"/>
+          <w:szCs w:val="36"/>
+          <w:lang w:val="en-GB" w:eastAsia="tr-TR"/>
+        </w:rPr>
+      </w:pPr>
+      <w:r>
+        <w:rPr>
+          <w:rFonts w:ascii="Aptos" w:eastAsia="Times New Roman" w:hAnsi="Aptos" w:cs="Times New Roman"/>
+          <w:b/>
+          <w:bCs/>
+          <w:color w:val="000000" w:themeColor="text1"/>
+          <w:sz w:val="36"/>
+          <w:szCs w:val="36"/>
+          <w:lang w:val="en-GB" w:eastAsia="tr-TR"/>
+        </w:rPr>
+        <w:t>UC</w:t>
+      </w:r>
+      <w:r>
+        <w:rPr>
+          <w:rFonts w:ascii="Aptos" w:eastAsia="Times New Roman" w:hAnsi="Aptos" w:cs="Times New Roman"/>
+          <w:b/>
+          <w:bCs/>
+          <w:color w:val="000000" w:themeColor="text1"/>
+          <w:sz w:val="36"/>
+          <w:szCs w:val="36"/>
+          <w:lang w:val="en-GB" w:eastAsia="tr-TR"/>
+        </w:rPr>
+        <w:t xml:space="preserve"> </w:t>
+      </w:r>
+      <w:proofErr w:type="gramStart"/>
+      <w:r>
+        <w:rPr>
+          <w:rFonts w:ascii="Aptos" w:eastAsia="Times New Roman" w:hAnsi="Aptos" w:cs="Times New Roman"/>
+          <w:b/>
+          <w:bCs/>
+          <w:color w:val="000000" w:themeColor="text1"/>
+          <w:sz w:val="36"/>
+          <w:szCs w:val="36"/>
+          <w:lang w:val="en-GB" w:eastAsia="tr-TR"/>
+        </w:rPr>
+        <w:t>1:User</w:t>
+      </w:r>
+      <w:proofErr w:type="gramEnd"/>
+      <w:r>
+        <w:rPr>
+          <w:rFonts w:ascii="Aptos" w:eastAsia="Times New Roman" w:hAnsi="Aptos" w:cs="Times New Roman"/>
+          <w:b/>
+          <w:bCs/>
+          <w:color w:val="000000" w:themeColor="text1"/>
+          <w:sz w:val="36"/>
+          <w:szCs w:val="36"/>
+          <w:lang w:val="en-GB" w:eastAsia="tr-TR"/>
+        </w:rPr>
+        <w:t xml:space="preserve"> Registration</w:t>
+      </w:r>
+    </w:p>
+    <w:p>
+      <w:pPr>
+        <w:pStyle w:val="ListeParagraf"/>
+        <w:numPr>
+          <w:ilvl w:val="0"/>
+          <w:numId w:val="9"/>
+        </w:numPr>
+        <w:spacing w:before="100" w:beforeAutospacing="1" w:after="100" w:afterAutospacing="1" w:line="240" w:lineRule="auto"/>
+        <w:outlineLvl w:val="1"/>
+        <w:rPr>
+          <w:rFonts w:ascii="Aptos" w:eastAsia="Times New Roman" w:hAnsi="Aptos" w:cs="Times New Roman"/>
+          <w:b/>
+          <w:bCs/>
+          <w:color w:val="000000" w:themeColor="text1"/>
+          <w:sz w:val="36"/>
+          <w:szCs w:val="36"/>
+          <w:lang w:val="en-GB" w:eastAsia="tr-TR"/>
+        </w:rPr>
+      </w:pPr>
+      <w:r>
+        <w:rPr>
+          <w:rFonts w:ascii="Aptos" w:eastAsia="Times New Roman" w:hAnsi="Aptos" w:cs="Times New Roman"/>
+          <w:b/>
+          <w:bCs/>
+          <w:color w:val="000000" w:themeColor="text1"/>
+          <w:sz w:val="36"/>
+          <w:szCs w:val="36"/>
+          <w:lang w:val="en-GB" w:eastAsia="tr-TR"/>
+        </w:rPr>
+        <w:t>UC 2: User Login</w:t>
+      </w:r>
+    </w:p>
+    <w:p>
+      <w:pPr>
+        <w:pStyle w:val="ListeParagraf"/>
+        <w:numPr>
+          <w:ilvl w:val="0"/>
+          <w:numId w:val="9"/>
+        </w:numPr>
+        <w:spacing w:before="100" w:beforeAutospacing="1" w:after="100" w:afterAutospacing="1" w:line="240" w:lineRule="auto"/>
+        <w:outlineLvl w:val="1"/>
+        <w:rPr>
+          <w:rFonts w:ascii="Aptos" w:eastAsia="Times New Roman" w:hAnsi="Aptos" w:cs="Times New Roman"/>
+          <w:b/>
+          <w:bCs/>
+          <w:color w:val="000000" w:themeColor="text1"/>
+          <w:sz w:val="36"/>
+          <w:szCs w:val="36"/>
+          <w:lang w:val="en-GB" w:eastAsia="tr-TR"/>
+        </w:rPr>
+      </w:pPr>
+      <w:r>
+        <w:rPr>
+          <w:rFonts w:ascii="Aptos" w:eastAsia="Times New Roman" w:hAnsi="Aptos" w:cs="Times New Roman"/>
+          <w:b/>
+          <w:bCs/>
+          <w:color w:val="000000" w:themeColor="text1"/>
+          <w:sz w:val="36"/>
+          <w:szCs w:val="36"/>
+          <w:lang w:val="en-GB" w:eastAsia="tr-TR"/>
+        </w:rPr>
+        <w:t xml:space="preserve">UC 3: Survey Submission &amp; </w:t>
+      </w:r>
+      <w:r>
+        <w:rPr>
+          <w:rFonts w:ascii="Aptos" w:eastAsia="Times New Roman" w:hAnsi="Aptos" w:cs="Times New Roman"/>
+          <w:b/>
+          <w:bCs/>
+          <w:color w:val="000000" w:themeColor="text1"/>
+          <w:sz w:val="36"/>
+          <w:szCs w:val="36"/>
+          <w:lang w:val="en-GB" w:eastAsia="tr-TR"/>
+        </w:rPr>
+        <w:t>Providing Feedback</w:t>
+      </w:r>
+    </w:p>
+    <w:p>
+      <w:pPr>
+        <w:pStyle w:val="ListeParagraf"/>
+        <w:numPr>
+          <w:ilvl w:val="0"/>
+          <w:numId w:val="9"/>
+        </w:numPr>
+        <w:spacing w:before="100" w:beforeAutospacing="1" w:after="100" w:afterAutospacing="1" w:line="240" w:lineRule="auto"/>
+        <w:outlineLvl w:val="1"/>
+        <w:rPr>
+          <w:rFonts w:ascii="Aptos" w:eastAsia="Times New Roman" w:hAnsi="Aptos" w:cs="Times New Roman"/>
+          <w:b/>
+          <w:bCs/>
+          <w:color w:val="000000" w:themeColor="text1"/>
+          <w:sz w:val="36"/>
+          <w:szCs w:val="36"/>
+          <w:lang w:val="en-GB" w:eastAsia="tr-TR"/>
+        </w:rPr>
+      </w:pPr>
+      <w:r>
+        <w:rPr>
+          <w:rFonts w:ascii="Aptos" w:eastAsia="Times New Roman" w:hAnsi="Aptos" w:cs="Times New Roman"/>
+          <w:b/>
+          <w:bCs/>
+          <w:color w:val="000000" w:themeColor="text1"/>
+          <w:sz w:val="36"/>
+          <w:szCs w:val="36"/>
+          <w:lang w:val="en-GB" w:eastAsia="tr-TR"/>
+        </w:rPr>
+        <w:t>UC 4: Survey History</w:t>
+      </w:r>
+    </w:p>
+    <w:p>
+      <w:pPr>
+        <w:pStyle w:val="ListeParagraf"/>
+        <w:numPr>
+          <w:ilvl w:val="0"/>
+          <w:numId w:val="9"/>
+        </w:numPr>
+        <w:spacing w:before="100" w:beforeAutospacing="1" w:after="100" w:afterAutospacing="1" w:line="240" w:lineRule="auto"/>
+        <w:outlineLvl w:val="1"/>
+        <w:rPr>
+          <w:rFonts w:ascii="Aptos" w:eastAsia="Times New Roman" w:hAnsi="Aptos" w:cs="Times New Roman"/>
+          <w:b/>
+          <w:bCs/>
+          <w:color w:val="000000" w:themeColor="text1"/>
+          <w:sz w:val="36"/>
+          <w:szCs w:val="36"/>
+          <w:lang w:val="en-GB" w:eastAsia="tr-TR"/>
+        </w:rPr>
+      </w:pPr>
+      <w:r>
+        <w:rPr>
+          <w:rFonts w:ascii="Aptos" w:eastAsia="Times New Roman" w:hAnsi="Aptos" w:cs="Times New Roman"/>
+          <w:b/>
+          <w:bCs/>
+          <w:color w:val="000000" w:themeColor="text1"/>
+          <w:sz w:val="36"/>
+          <w:szCs w:val="36"/>
+          <w:lang w:val="en-GB" w:eastAsia="tr-TR"/>
+        </w:rPr>
+        <w:t>Conclusion</w:t>
+      </w:r>
+      <w:r>
+        <w:rPr>
+          <w:rFonts w:ascii="Aptos" w:eastAsia="Times New Roman" w:hAnsi="Aptos" w:cs="Times New Roman"/>
+          <w:b/>
+          <w:bCs/>
+          <w:color w:val="000000" w:themeColor="text1"/>
+          <w:sz w:val="36"/>
+          <w:szCs w:val="36"/>
+          <w:lang w:val="en-GB" w:eastAsia="tr-TR"/>
+        </w:rPr>
+        <w:br/>
+      </w:r>
+      <w:r>
+        <w:rPr>
+          <w:rFonts w:ascii="Aptos" w:eastAsia="Times New Roman" w:hAnsi="Aptos" w:cs="Times New Roman"/>
+          <w:b/>
+          <w:bCs/>
+          <w:color w:val="000000" w:themeColor="text1"/>
+          <w:sz w:val="36"/>
+          <w:szCs w:val="36"/>
+          <w:lang w:val="en-GB" w:eastAsia="tr-TR"/>
+        </w:rPr>
+        <w:br/>
+      </w:r>
+      <w:r>
+        <w:rPr>
+          <w:rFonts w:ascii="Aptos" w:eastAsia="Times New Roman" w:hAnsi="Aptos" w:cs="Times New Roman"/>
+          <w:b/>
+          <w:bCs/>
+          <w:color w:val="000000" w:themeColor="text1"/>
+          <w:sz w:val="36"/>
+          <w:szCs w:val="36"/>
+          <w:lang w:val="en-GB" w:eastAsia="tr-TR"/>
+        </w:rPr>
+        <w:br/>
+      </w:r>
+      <w:r>
+        <w:rPr>
+          <w:rFonts w:ascii="Aptos" w:eastAsia="Times New Roman" w:hAnsi="Aptos" w:cs="Times New Roman"/>
+          <w:b/>
+          <w:bCs/>
+          <w:color w:val="000000" w:themeColor="text1"/>
+          <w:sz w:val="36"/>
+          <w:szCs w:val="36"/>
+          <w:lang w:val="en-GB" w:eastAsia="tr-TR"/>
+        </w:rPr>
+        <w:br/>
+      </w:r>
+      <w:r>
+        <w:rPr>
+          <w:rFonts w:ascii="Aptos" w:eastAsia="Times New Roman" w:hAnsi="Aptos" w:cs="Times New Roman"/>
+          <w:b/>
+          <w:bCs/>
+          <w:color w:val="000000" w:themeColor="text1"/>
+          <w:sz w:val="36"/>
+          <w:szCs w:val="36"/>
+          <w:lang w:val="en-GB" w:eastAsia="tr-TR"/>
+        </w:rPr>
+        <w:br/>
+      </w:r>
+      <w:r>
+        <w:rPr>
+          <w:rFonts w:ascii="Aptos" w:eastAsia="Times New Roman" w:hAnsi="Aptos" w:cs="Times New Roman"/>
+          <w:b/>
+          <w:bCs/>
+          <w:color w:val="000000" w:themeColor="text1"/>
+          <w:sz w:val="36"/>
+          <w:szCs w:val="36"/>
+          <w:lang w:val="en-GB" w:eastAsia="tr-TR"/>
+        </w:rPr>
+        <w:br/>
+      </w:r>
+      <w:r>
+        <w:rPr>
+          <w:rFonts w:ascii="Aptos" w:eastAsia="Times New Roman" w:hAnsi="Aptos" w:cs="Times New Roman"/>
+          <w:b/>
+          <w:bCs/>
+          <w:color w:val="000000" w:themeColor="text1"/>
+          <w:sz w:val="36"/>
+          <w:szCs w:val="36"/>
+          <w:lang w:val="en-GB" w:eastAsia="tr-TR"/>
+        </w:rPr>
+        <w:br/>
+        <w:t xml:space="preserve">Writer: </w:t>
+      </w:r>
+      <w:proofErr w:type="spellStart"/>
+      <w:r>
+        <w:rPr>
+          <w:rFonts w:ascii="Aptos" w:eastAsia="Times New Roman" w:hAnsi="Aptos" w:cs="Times New Roman"/>
+          <w:b/>
+          <w:bCs/>
+          <w:color w:val="000000" w:themeColor="text1"/>
+          <w:sz w:val="36"/>
+          <w:szCs w:val="36"/>
+          <w:lang w:val="en-GB" w:eastAsia="tr-TR"/>
+        </w:rPr>
+        <w:t>Defne</w:t>
+      </w:r>
+      <w:proofErr w:type="spellEnd"/>
+      <w:r>
+        <w:rPr>
+          <w:rFonts w:ascii="Aptos" w:eastAsia="Times New Roman" w:hAnsi="Aptos" w:cs="Times New Roman"/>
+          <w:b/>
+          <w:bCs/>
+          <w:color w:val="000000" w:themeColor="text1"/>
+          <w:sz w:val="36"/>
+          <w:szCs w:val="36"/>
+          <w:lang w:val="en-GB" w:eastAsia="tr-TR"/>
+        </w:rPr>
+        <w:t xml:space="preserve"> </w:t>
+      </w:r>
+      <w:proofErr w:type="spellStart"/>
+      <w:r>
+        <w:rPr>
+          <w:rFonts w:ascii="Aptos" w:eastAsia="Times New Roman" w:hAnsi="Aptos" w:cs="Times New Roman"/>
+          <w:b/>
+          <w:bCs/>
+          <w:color w:val="000000" w:themeColor="text1"/>
+          <w:sz w:val="36"/>
+          <w:szCs w:val="36"/>
+          <w:lang w:val="en-GB" w:eastAsia="tr-TR"/>
+        </w:rPr>
+        <w:t>Saracel</w:t>
+      </w:r>
+      <w:proofErr w:type="spellEnd"/>
+    </w:p>
+    <w:p>
+      <w:pPr>
+        <w:spacing w:before="100" w:beforeAutospacing="1" w:after="100" w:afterAutospacing="1" w:line="240" w:lineRule="auto"/>
+        <w:outlineLvl w:val="1"/>
+        <w:rPr>
+          <w:rFonts w:ascii="Aptos" w:eastAsia="Times New Roman" w:hAnsi="Aptos" w:cs="Times New Roman"/>
+          <w:b/>
+          <w:bCs/>
+          <w:color w:val="000000" w:themeColor="text1"/>
+          <w:sz w:val="36"/>
+          <w:szCs w:val="36"/>
+          <w:lang w:val="en-GB" w:eastAsia="tr-TR"/>
+        </w:rPr>
+      </w:pPr>
+    </w:p>
+    <w:p>
+      <w:pPr>
+        <w:spacing w:before="100" w:beforeAutospacing="1" w:after="100" w:afterAutospacing="1" w:line="240" w:lineRule="auto"/>
+        <w:outlineLvl w:val="1"/>
+        <w:rPr>
+          <w:rFonts w:ascii="Aptos" w:eastAsia="Times New Roman" w:hAnsi="Aptos" w:cs="Times New Roman"/>
+          <w:b/>
+          <w:bCs/>
+          <w:color w:val="000000" w:themeColor="text1"/>
+          <w:sz w:val="36"/>
+          <w:szCs w:val="36"/>
+          <w:lang w:val="en-GB" w:eastAsia="tr-TR"/>
+        </w:rPr>
+      </w:pPr>
+    </w:p>
+    <w:p>
+      <w:pPr>
+        <w:spacing w:before="100" w:beforeAutospacing="1" w:after="100" w:afterAutospacing="1" w:line="240" w:lineRule="auto"/>
+        <w:outlineLvl w:val="1"/>
+        <w:rPr>
+          <w:rFonts w:ascii="Aptos" w:eastAsia="Times New Roman" w:hAnsi="Aptos" w:cs="Times New Roman"/>
+          <w:b/>
+          <w:bCs/>
+          <w:color w:val="000000" w:themeColor="text1"/>
+          <w:sz w:val="36"/>
+          <w:szCs w:val="36"/>
+          <w:lang w:val="en-GB" w:eastAsia="tr-TR"/>
+        </w:rPr>
+      </w:pPr>
+    </w:p>
+    <w:p>
+      <w:pPr>
+        <w:spacing w:before="100" w:beforeAutospacing="1" w:after="100" w:afterAutospacing="1" w:line="240" w:lineRule="auto"/>
+        <w:outlineLvl w:val="1"/>
+        <w:rPr>
+          <w:rFonts w:ascii="Aptos" w:eastAsia="Times New Roman" w:hAnsi="Aptos" w:cs="Times New Roman"/>
+          <w:b/>
+          <w:bCs/>
+          <w:color w:val="000000" w:themeColor="text1"/>
+          <w:sz w:val="36"/>
+          <w:szCs w:val="36"/>
+          <w:lang w:val="en-GB" w:eastAsia="tr-TR"/>
+        </w:rPr>
+      </w:pPr>
+    </w:p>
+    <w:p>
+      <w:pPr>
+        <w:spacing w:before="100" w:beforeAutospacing="1" w:after="100" w:afterAutospacing="1" w:line="240" w:lineRule="auto"/>
+        <w:outlineLvl w:val="1"/>
+        <w:rPr>
+          <w:rFonts w:ascii="Aptos" w:eastAsia="Times New Roman" w:hAnsi="Aptos" w:cs="Times New Roman"/>
+          <w:b/>
+          <w:bCs/>
+          <w:color w:val="000000" w:themeColor="text1"/>
+          <w:sz w:val="36"/>
+          <w:szCs w:val="36"/>
+          <w:lang w:val="en-GB" w:eastAsia="tr-TR"/>
+        </w:rPr>
+      </w:pPr>
+    </w:p>
+    <w:p>
+      <w:pPr>
+        <w:spacing w:before="100" w:beforeAutospacing="1" w:after="100" w:afterAutospacing="1" w:line="240" w:lineRule="auto"/>
+        <w:outlineLvl w:val="1"/>
+        <w:rPr>
+          <w:rFonts w:ascii="Aptos" w:eastAsia="Times New Roman" w:hAnsi="Aptos" w:cs="Times New Roman"/>
+          <w:b/>
+          <w:bCs/>
+          <w:color w:val="000000" w:themeColor="text1"/>
+          <w:sz w:val="36"/>
+          <w:szCs w:val="36"/>
+          <w:lang w:val="en-GB" w:eastAsia="tr-TR"/>
+        </w:rPr>
+      </w:pPr>
+    </w:p>
+    <w:p>
+      <w:pPr>
+        <w:spacing w:before="100" w:beforeAutospacing="1" w:after="100" w:afterAutospacing="1" w:line="240" w:lineRule="auto"/>
+        <w:outlineLvl w:val="1"/>
+        <w:rPr>
+          <w:rFonts w:ascii="Aptos" w:eastAsia="Times New Roman" w:hAnsi="Aptos" w:cs="Times New Roman"/>
+          <w:b/>
+          <w:bCs/>
+          <w:color w:val="000000" w:themeColor="text1"/>
+          <w:sz w:val="36"/>
+          <w:szCs w:val="36"/>
+          <w:lang w:val="en-GB" w:eastAsia="tr-TR"/>
+        </w:rPr>
+      </w:pPr>
+      <w:r>
+        <w:rPr>
+          <w:rFonts w:ascii="Aptos" w:eastAsia="Times New Roman" w:hAnsi="Aptos" w:cs="Times New Roman"/>
+          <w:b/>
+          <w:bCs/>
+          <w:color w:val="000000" w:themeColor="text1"/>
+          <w:sz w:val="36"/>
+          <w:szCs w:val="36"/>
+          <w:lang w:val="en-GB" w:eastAsia="tr-TR"/>
+        </w:rPr>
+        <w:t>Introduction</w:t>
+      </w:r>
+      <w:r>
+        <w:rPr>
+          <w:rFonts w:ascii="Aptos" w:eastAsia="Times New Roman" w:hAnsi="Aptos" w:cs="Times New Roman"/>
+          <w:b/>
+          <w:bCs/>
+          <w:color w:val="000000" w:themeColor="text1"/>
+          <w:sz w:val="36"/>
+          <w:szCs w:val="36"/>
+          <w:lang w:val="en-GB" w:eastAsia="tr-TR"/>
+        </w:rPr>
+        <w:tab/>
+      </w:r>
+    </w:p>
+    <w:p>
+      <w:pPr>
+        <w:spacing w:before="100" w:beforeAutospacing="1" w:after="100" w:afterAutospacing="1" w:line="240" w:lineRule="auto"/>
+        <w:outlineLvl w:val="1"/>
+        <w:rPr>
+          <w:rFonts w:ascii="Aptos" w:eastAsia="Times New Roman" w:hAnsi="Aptos" w:cs="Times New Roman"/>
+          <w:bCs/>
+          <w:color w:val="000000" w:themeColor="text1"/>
+          <w:sz w:val="24"/>
+          <w:szCs w:val="24"/>
+          <w:lang w:val="en-GB" w:eastAsia="tr-TR"/>
+        </w:rPr>
+      </w:pPr>
+      <w:r>
+        <w:rPr>
+          <w:rFonts w:ascii="Aptos" w:eastAsia="Times New Roman" w:hAnsi="Aptos" w:cs="Times New Roman"/>
+          <w:bCs/>
+          <w:color w:val="000000" w:themeColor="text1"/>
+          <w:sz w:val="24"/>
+          <w:szCs w:val="24"/>
+          <w:lang w:val="en-GB" w:eastAsia="tr-TR"/>
+        </w:rPr>
+        <w:t xml:space="preserve">This the Acceptance Test &amp; Acceptance Criteria Document for our web application </w:t>
+      </w:r>
+      <w:proofErr w:type="spellStart"/>
+      <w:proofErr w:type="gramStart"/>
+      <w:r>
+        <w:rPr>
+          <w:rFonts w:ascii="Aptos" w:eastAsia="Times New Roman" w:hAnsi="Aptos" w:cs="Times New Roman"/>
+          <w:bCs/>
+          <w:color w:val="000000" w:themeColor="text1"/>
+          <w:sz w:val="24"/>
+          <w:szCs w:val="24"/>
+          <w:lang w:val="en-GB" w:eastAsia="tr-TR"/>
+        </w:rPr>
+        <w:t>Planeta</w:t>
+      </w:r>
+      <w:proofErr w:type="spellEnd"/>
+      <w:r>
+        <w:rPr>
+          <w:rFonts w:ascii="Aptos" w:eastAsia="Times New Roman" w:hAnsi="Aptos" w:cs="Times New Roman"/>
+          <w:bCs/>
+          <w:color w:val="000000" w:themeColor="text1"/>
+          <w:sz w:val="24"/>
+          <w:szCs w:val="24"/>
+          <w:lang w:val="en-GB" w:eastAsia="tr-TR"/>
+        </w:rPr>
+        <w:t xml:space="preserve"> .</w:t>
+      </w:r>
+      <w:proofErr w:type="spellStart"/>
+      <w:r>
+        <w:rPr>
+          <w:rFonts w:ascii="Aptos" w:hAnsi="Aptos"/>
+          <w:sz w:val="24"/>
+          <w:szCs w:val="24"/>
+        </w:rPr>
+        <w:t>The</w:t>
+      </w:r>
+      <w:proofErr w:type="spellEnd"/>
+      <w:proofErr w:type="gramEnd"/>
+      <w:r>
+        <w:rPr>
+          <w:rFonts w:ascii="Aptos" w:hAnsi="Aptos"/>
+          <w:sz w:val="24"/>
+          <w:szCs w:val="24"/>
+        </w:rPr>
+        <w:t xml:space="preserve"> </w:t>
+      </w:r>
+      <w:proofErr w:type="spellStart"/>
+      <w:r>
+        <w:rPr>
+          <w:rFonts w:ascii="Aptos" w:hAnsi="Aptos"/>
+          <w:sz w:val="24"/>
+          <w:szCs w:val="24"/>
+        </w:rPr>
+        <w:t>purpose</w:t>
+      </w:r>
+      <w:proofErr w:type="spellEnd"/>
+      <w:r>
+        <w:rPr>
+          <w:rFonts w:ascii="Aptos" w:hAnsi="Aptos"/>
+          <w:sz w:val="24"/>
+          <w:szCs w:val="24"/>
+        </w:rPr>
+        <w:t xml:space="preserve"> of </w:t>
+      </w:r>
+      <w:proofErr w:type="spellStart"/>
+      <w:r>
+        <w:rPr>
+          <w:rFonts w:ascii="Aptos" w:hAnsi="Aptos"/>
+          <w:sz w:val="24"/>
+          <w:szCs w:val="24"/>
+        </w:rPr>
+        <w:t>this</w:t>
+      </w:r>
+      <w:proofErr w:type="spellEnd"/>
+      <w:r>
+        <w:rPr>
+          <w:rFonts w:ascii="Aptos" w:hAnsi="Aptos"/>
+          <w:sz w:val="24"/>
+          <w:szCs w:val="24"/>
+        </w:rPr>
+        <w:t xml:space="preserve"> </w:t>
+      </w:r>
+      <w:proofErr w:type="spellStart"/>
+      <w:r>
+        <w:rPr>
+          <w:rFonts w:ascii="Aptos" w:hAnsi="Aptos"/>
+          <w:sz w:val="24"/>
+          <w:szCs w:val="24"/>
+        </w:rPr>
+        <w:t>document</w:t>
+      </w:r>
+      <w:proofErr w:type="spellEnd"/>
+      <w:r>
+        <w:rPr>
+          <w:rFonts w:ascii="Aptos" w:hAnsi="Aptos"/>
+          <w:sz w:val="24"/>
+          <w:szCs w:val="24"/>
+        </w:rPr>
+        <w:t xml:space="preserve"> is </w:t>
+      </w:r>
+      <w:proofErr w:type="spellStart"/>
+      <w:r>
+        <w:rPr>
+          <w:rFonts w:ascii="Aptos" w:hAnsi="Aptos"/>
+          <w:sz w:val="24"/>
+          <w:szCs w:val="24"/>
+        </w:rPr>
+        <w:t>to</w:t>
+      </w:r>
+      <w:proofErr w:type="spellEnd"/>
+      <w:r>
+        <w:rPr>
+          <w:rFonts w:ascii="Aptos" w:hAnsi="Aptos"/>
+          <w:sz w:val="24"/>
+          <w:szCs w:val="24"/>
+        </w:rPr>
+        <w:t xml:space="preserve"> </w:t>
+      </w:r>
+      <w:proofErr w:type="spellStart"/>
+      <w:r>
+        <w:rPr>
+          <w:rFonts w:ascii="Aptos" w:hAnsi="Aptos"/>
+          <w:sz w:val="24"/>
+          <w:szCs w:val="24"/>
+        </w:rPr>
+        <w:t>formally</w:t>
+      </w:r>
+      <w:proofErr w:type="spellEnd"/>
+      <w:r>
+        <w:rPr>
+          <w:rFonts w:ascii="Aptos" w:hAnsi="Aptos"/>
+          <w:sz w:val="24"/>
+          <w:szCs w:val="24"/>
+        </w:rPr>
+        <w:t xml:space="preserve"> define </w:t>
+      </w:r>
+      <w:proofErr w:type="spellStart"/>
+      <w:r>
+        <w:rPr>
+          <w:rFonts w:ascii="Aptos" w:hAnsi="Aptos"/>
+          <w:sz w:val="24"/>
+          <w:szCs w:val="24"/>
+        </w:rPr>
+        <w:t>the</w:t>
+      </w:r>
+      <w:proofErr w:type="spellEnd"/>
+      <w:r>
+        <w:rPr>
+          <w:rFonts w:ascii="Aptos" w:hAnsi="Aptos"/>
+          <w:sz w:val="24"/>
+          <w:szCs w:val="24"/>
+        </w:rPr>
+        <w:t xml:space="preserve"> </w:t>
+      </w:r>
+      <w:proofErr w:type="spellStart"/>
+      <w:r>
+        <w:rPr>
+          <w:rFonts w:ascii="Aptos" w:hAnsi="Aptos"/>
+          <w:sz w:val="24"/>
+          <w:szCs w:val="24"/>
+        </w:rPr>
+        <w:t>expected</w:t>
+      </w:r>
+      <w:proofErr w:type="spellEnd"/>
+      <w:r>
+        <w:rPr>
+          <w:rFonts w:ascii="Aptos" w:hAnsi="Aptos"/>
+          <w:sz w:val="24"/>
+          <w:szCs w:val="24"/>
+        </w:rPr>
+        <w:t xml:space="preserve"> </w:t>
+      </w:r>
+      <w:proofErr w:type="spellStart"/>
+      <w:r>
+        <w:rPr>
+          <w:rFonts w:ascii="Aptos" w:hAnsi="Aptos"/>
+          <w:sz w:val="24"/>
+          <w:szCs w:val="24"/>
+        </w:rPr>
+        <w:t>behaviors</w:t>
+      </w:r>
+      <w:proofErr w:type="spellEnd"/>
+      <w:r>
+        <w:rPr>
+          <w:rFonts w:ascii="Aptos" w:hAnsi="Aptos"/>
+          <w:sz w:val="24"/>
+          <w:szCs w:val="24"/>
+        </w:rPr>
+        <w:t xml:space="preserve"> </w:t>
+      </w:r>
+      <w:proofErr w:type="spellStart"/>
+      <w:r>
+        <w:rPr>
+          <w:rFonts w:ascii="Aptos" w:hAnsi="Aptos"/>
+          <w:sz w:val="24"/>
+          <w:szCs w:val="24"/>
+        </w:rPr>
+        <w:t>for</w:t>
+      </w:r>
+      <w:proofErr w:type="spellEnd"/>
+      <w:r>
+        <w:rPr>
+          <w:rFonts w:ascii="Aptos" w:hAnsi="Aptos"/>
+          <w:sz w:val="24"/>
+          <w:szCs w:val="24"/>
+        </w:rPr>
+        <w:t xml:space="preserve"> </w:t>
+      </w:r>
+      <w:proofErr w:type="spellStart"/>
+      <w:r>
+        <w:rPr>
+          <w:rFonts w:ascii="Aptos" w:hAnsi="Aptos"/>
+          <w:sz w:val="24"/>
+          <w:szCs w:val="24"/>
+        </w:rPr>
+        <w:t>each</w:t>
+      </w:r>
+      <w:proofErr w:type="spellEnd"/>
+      <w:r>
+        <w:rPr>
+          <w:rFonts w:ascii="Aptos" w:hAnsi="Aptos"/>
+          <w:sz w:val="24"/>
+          <w:szCs w:val="24"/>
+        </w:rPr>
+        <w:t xml:space="preserve"> </w:t>
+      </w:r>
+      <w:bookmarkStart w:id="0" w:name="_GoBack"/>
+      <w:bookmarkEnd w:id="0"/>
+      <w:proofErr w:type="spellStart"/>
+      <w:r>
+        <w:rPr>
+          <w:rFonts w:ascii="Aptos" w:hAnsi="Aptos"/>
+          <w:sz w:val="24"/>
+          <w:szCs w:val="24"/>
+        </w:rPr>
+        <w:t>use</w:t>
+      </w:r>
+      <w:proofErr w:type="spellEnd"/>
+      <w:r>
+        <w:rPr>
+          <w:rFonts w:ascii="Aptos" w:hAnsi="Aptos"/>
+          <w:sz w:val="24"/>
+          <w:szCs w:val="24"/>
+        </w:rPr>
+        <w:t xml:space="preserve"> </w:t>
+      </w:r>
+      <w:proofErr w:type="spellStart"/>
+      <w:r>
+        <w:rPr>
+          <w:rFonts w:ascii="Aptos" w:hAnsi="Aptos"/>
+          <w:sz w:val="24"/>
+          <w:szCs w:val="24"/>
+        </w:rPr>
+        <w:t>case</w:t>
+      </w:r>
+      <w:proofErr w:type="spellEnd"/>
+      <w:r>
+        <w:rPr>
+          <w:rFonts w:ascii="Aptos" w:hAnsi="Aptos"/>
+          <w:sz w:val="24"/>
+          <w:szCs w:val="24"/>
+        </w:rPr>
+        <w:t xml:space="preserve"> (UC1 </w:t>
+      </w:r>
+      <w:proofErr w:type="spellStart"/>
+      <w:r>
+        <w:rPr>
+          <w:rFonts w:ascii="Aptos" w:hAnsi="Aptos"/>
+          <w:sz w:val="24"/>
+          <w:szCs w:val="24"/>
+        </w:rPr>
+        <w:t>through</w:t>
+      </w:r>
+      <w:proofErr w:type="spellEnd"/>
+      <w:r>
+        <w:rPr>
+          <w:rFonts w:ascii="Aptos" w:hAnsi="Aptos"/>
+          <w:sz w:val="24"/>
+          <w:szCs w:val="24"/>
+        </w:rPr>
+        <w:t xml:space="preserve"> UC4) </w:t>
+      </w:r>
+      <w:proofErr w:type="spellStart"/>
+      <w:r>
+        <w:rPr>
+          <w:rFonts w:ascii="Aptos" w:hAnsi="Aptos"/>
+          <w:sz w:val="24"/>
+          <w:szCs w:val="24"/>
+        </w:rPr>
+        <w:t>and</w:t>
+      </w:r>
+      <w:proofErr w:type="spellEnd"/>
+      <w:r>
+        <w:rPr>
+          <w:rFonts w:ascii="Aptos" w:hAnsi="Aptos"/>
+          <w:sz w:val="24"/>
+          <w:szCs w:val="24"/>
+        </w:rPr>
+        <w:t xml:space="preserve"> </w:t>
+      </w:r>
+      <w:proofErr w:type="spellStart"/>
+      <w:r>
+        <w:rPr>
+          <w:rFonts w:ascii="Aptos" w:hAnsi="Aptos"/>
+          <w:sz w:val="24"/>
+          <w:szCs w:val="24"/>
+        </w:rPr>
+        <w:t>to</w:t>
+      </w:r>
+      <w:proofErr w:type="spellEnd"/>
+      <w:r>
+        <w:rPr>
+          <w:rFonts w:ascii="Aptos" w:hAnsi="Aptos"/>
+          <w:sz w:val="24"/>
+          <w:szCs w:val="24"/>
+        </w:rPr>
+        <w:t xml:space="preserve"> </w:t>
+      </w:r>
+      <w:proofErr w:type="spellStart"/>
+      <w:r>
+        <w:rPr>
+          <w:rFonts w:ascii="Aptos" w:hAnsi="Aptos"/>
+          <w:sz w:val="24"/>
+          <w:szCs w:val="24"/>
+        </w:rPr>
+        <w:t>provide</w:t>
+      </w:r>
+      <w:proofErr w:type="spellEnd"/>
+      <w:r>
+        <w:rPr>
+          <w:rFonts w:ascii="Aptos" w:hAnsi="Aptos"/>
+          <w:sz w:val="24"/>
+          <w:szCs w:val="24"/>
+        </w:rPr>
+        <w:t xml:space="preserve"> </w:t>
+      </w:r>
+      <w:proofErr w:type="spellStart"/>
+      <w:r>
+        <w:rPr>
+          <w:rFonts w:ascii="Aptos" w:hAnsi="Aptos"/>
+          <w:sz w:val="24"/>
+          <w:szCs w:val="24"/>
+        </w:rPr>
+        <w:t>corresponding</w:t>
+      </w:r>
+      <w:proofErr w:type="spellEnd"/>
+      <w:r>
+        <w:rPr>
+          <w:rFonts w:ascii="Aptos" w:hAnsi="Aptos"/>
+          <w:sz w:val="24"/>
+          <w:szCs w:val="24"/>
+        </w:rPr>
+        <w:t xml:space="preserve"> test </w:t>
+      </w:r>
+      <w:proofErr w:type="spellStart"/>
+      <w:r>
+        <w:rPr>
+          <w:rFonts w:ascii="Aptos" w:hAnsi="Aptos"/>
+          <w:sz w:val="24"/>
+          <w:szCs w:val="24"/>
+        </w:rPr>
+        <w:t>cases</w:t>
+      </w:r>
+      <w:proofErr w:type="spellEnd"/>
+      <w:r>
+        <w:rPr>
+          <w:rFonts w:ascii="Aptos" w:hAnsi="Aptos"/>
+          <w:sz w:val="24"/>
+          <w:szCs w:val="24"/>
+        </w:rPr>
+        <w:t xml:space="preserve"> </w:t>
+      </w:r>
+      <w:proofErr w:type="spellStart"/>
+      <w:r>
+        <w:rPr>
+          <w:rFonts w:ascii="Aptos" w:hAnsi="Aptos"/>
+          <w:sz w:val="24"/>
+          <w:szCs w:val="24"/>
+        </w:rPr>
+        <w:t>that</w:t>
+      </w:r>
+      <w:proofErr w:type="spellEnd"/>
+      <w:r>
+        <w:rPr>
+          <w:rFonts w:ascii="Aptos" w:hAnsi="Aptos"/>
+          <w:sz w:val="24"/>
+          <w:szCs w:val="24"/>
+        </w:rPr>
+        <w:t xml:space="preserve"> </w:t>
+      </w:r>
+      <w:proofErr w:type="spellStart"/>
+      <w:r>
+        <w:rPr>
+          <w:rFonts w:ascii="Aptos" w:hAnsi="Aptos"/>
+          <w:sz w:val="24"/>
+          <w:szCs w:val="24"/>
+        </w:rPr>
+        <w:t>verify</w:t>
+      </w:r>
+      <w:proofErr w:type="spellEnd"/>
+      <w:r>
+        <w:rPr>
+          <w:rFonts w:ascii="Aptos" w:hAnsi="Aptos"/>
+          <w:sz w:val="24"/>
+          <w:szCs w:val="24"/>
+        </w:rPr>
+        <w:t xml:space="preserve"> </w:t>
+      </w:r>
+      <w:proofErr w:type="spellStart"/>
+      <w:r>
+        <w:rPr>
+          <w:rFonts w:ascii="Aptos" w:hAnsi="Aptos"/>
+          <w:sz w:val="24"/>
+          <w:szCs w:val="24"/>
+        </w:rPr>
+        <w:t>those</w:t>
+      </w:r>
+      <w:proofErr w:type="spellEnd"/>
+      <w:r>
+        <w:rPr>
+          <w:rFonts w:ascii="Aptos" w:hAnsi="Aptos"/>
+          <w:sz w:val="24"/>
+          <w:szCs w:val="24"/>
+        </w:rPr>
+        <w:t xml:space="preserve"> </w:t>
+      </w:r>
+      <w:proofErr w:type="spellStart"/>
+      <w:r>
+        <w:rPr>
+          <w:rFonts w:ascii="Aptos" w:hAnsi="Aptos"/>
+          <w:sz w:val="24"/>
+          <w:szCs w:val="24"/>
+        </w:rPr>
+        <w:t>behaviors</w:t>
+      </w:r>
+      <w:proofErr w:type="spellEnd"/>
+      <w:r>
+        <w:rPr>
+          <w:rFonts w:ascii="Aptos" w:hAnsi="Aptos"/>
+          <w:sz w:val="24"/>
+          <w:szCs w:val="24"/>
+        </w:rPr>
+        <w:t xml:space="preserve">. </w:t>
+      </w:r>
+      <w:proofErr w:type="spellStart"/>
+      <w:r>
+        <w:rPr>
+          <w:rFonts w:ascii="Aptos" w:hAnsi="Aptos"/>
+          <w:sz w:val="24"/>
+          <w:szCs w:val="24"/>
+        </w:rPr>
+        <w:t>Each</w:t>
+      </w:r>
+      <w:proofErr w:type="spellEnd"/>
+      <w:r>
+        <w:rPr>
+          <w:rFonts w:ascii="Aptos" w:hAnsi="Aptos"/>
+          <w:sz w:val="24"/>
+          <w:szCs w:val="24"/>
+        </w:rPr>
+        <w:t xml:space="preserve"> </w:t>
+      </w:r>
+      <w:proofErr w:type="spellStart"/>
+      <w:r>
+        <w:rPr>
+          <w:rFonts w:ascii="Aptos" w:hAnsi="Aptos"/>
+          <w:sz w:val="24"/>
+          <w:szCs w:val="24"/>
+        </w:rPr>
+        <w:t>section</w:t>
+      </w:r>
+      <w:proofErr w:type="spellEnd"/>
+      <w:r>
+        <w:rPr>
+          <w:rFonts w:ascii="Aptos" w:hAnsi="Aptos"/>
+          <w:sz w:val="24"/>
+          <w:szCs w:val="24"/>
+        </w:rPr>
+        <w:t xml:space="preserve"> </w:t>
+      </w:r>
+      <w:proofErr w:type="spellStart"/>
+      <w:r>
+        <w:rPr>
+          <w:rFonts w:ascii="Aptos" w:hAnsi="Aptos"/>
+          <w:sz w:val="24"/>
+          <w:szCs w:val="24"/>
+        </w:rPr>
+        <w:t>specifies</w:t>
+      </w:r>
+      <w:proofErr w:type="spellEnd"/>
+      <w:r>
+        <w:rPr>
+          <w:rFonts w:ascii="Aptos" w:hAnsi="Aptos"/>
+          <w:sz w:val="24"/>
+          <w:szCs w:val="24"/>
+        </w:rPr>
+        <w:t xml:space="preserve"> </w:t>
+      </w:r>
+      <w:proofErr w:type="spellStart"/>
+      <w:r>
+        <w:rPr>
+          <w:rFonts w:ascii="Aptos" w:hAnsi="Aptos"/>
+          <w:sz w:val="24"/>
+          <w:szCs w:val="24"/>
+        </w:rPr>
+        <w:t>the</w:t>
+      </w:r>
+      <w:proofErr w:type="spellEnd"/>
+      <w:r>
+        <w:rPr>
+          <w:rFonts w:ascii="Aptos" w:hAnsi="Aptos"/>
+          <w:sz w:val="24"/>
+          <w:szCs w:val="24"/>
+        </w:rPr>
+        <w:t xml:space="preserve"> </w:t>
+      </w:r>
+      <w:proofErr w:type="spellStart"/>
+      <w:r>
+        <w:rPr>
+          <w:rFonts w:ascii="Aptos" w:hAnsi="Aptos"/>
+          <w:sz w:val="24"/>
+          <w:szCs w:val="24"/>
+        </w:rPr>
+        <w:t>acceptance</w:t>
+      </w:r>
+      <w:proofErr w:type="spellEnd"/>
+      <w:r>
+        <w:rPr>
+          <w:rFonts w:ascii="Aptos" w:hAnsi="Aptos"/>
+          <w:sz w:val="24"/>
+          <w:szCs w:val="24"/>
+        </w:rPr>
+        <w:t xml:space="preserve"> </w:t>
+      </w:r>
+      <w:proofErr w:type="spellStart"/>
+      <w:r>
+        <w:rPr>
+          <w:rFonts w:ascii="Aptos" w:hAnsi="Aptos"/>
+          <w:sz w:val="24"/>
+          <w:szCs w:val="24"/>
+        </w:rPr>
+        <w:t>criteria</w:t>
+      </w:r>
+      <w:proofErr w:type="spellEnd"/>
+      <w:r>
+        <w:rPr>
+          <w:rFonts w:ascii="Aptos" w:hAnsi="Aptos"/>
+          <w:sz w:val="24"/>
+          <w:szCs w:val="24"/>
+        </w:rPr>
+        <w:t xml:space="preserve"> </w:t>
+      </w:r>
+      <w:proofErr w:type="spellStart"/>
+      <w:r>
+        <w:rPr>
+          <w:rFonts w:ascii="Aptos" w:hAnsi="Aptos"/>
+          <w:sz w:val="24"/>
+          <w:szCs w:val="24"/>
+        </w:rPr>
+        <w:t>that</w:t>
+      </w:r>
+      <w:proofErr w:type="spellEnd"/>
+      <w:r>
+        <w:rPr>
+          <w:rFonts w:ascii="Aptos" w:hAnsi="Aptos"/>
+          <w:sz w:val="24"/>
+          <w:szCs w:val="24"/>
+        </w:rPr>
+        <w:t xml:space="preserve"> </w:t>
+      </w:r>
+      <w:proofErr w:type="spellStart"/>
+      <w:r>
+        <w:rPr>
+          <w:rFonts w:ascii="Aptos" w:hAnsi="Aptos"/>
+          <w:sz w:val="24"/>
+          <w:szCs w:val="24"/>
+        </w:rPr>
+        <w:t>the</w:t>
+      </w:r>
+      <w:proofErr w:type="spellEnd"/>
+      <w:r>
+        <w:rPr>
+          <w:rFonts w:ascii="Aptos" w:hAnsi="Aptos"/>
+          <w:sz w:val="24"/>
+          <w:szCs w:val="24"/>
+        </w:rPr>
+        <w:t xml:space="preserve"> </w:t>
+      </w:r>
+      <w:proofErr w:type="spellStart"/>
+      <w:r>
+        <w:rPr>
+          <w:rFonts w:ascii="Aptos" w:hAnsi="Aptos"/>
+          <w:sz w:val="24"/>
+          <w:szCs w:val="24"/>
+        </w:rPr>
+        <w:t>system</w:t>
+      </w:r>
+      <w:proofErr w:type="spellEnd"/>
+      <w:r>
+        <w:rPr>
+          <w:rFonts w:ascii="Aptos" w:hAnsi="Aptos"/>
+          <w:sz w:val="24"/>
+          <w:szCs w:val="24"/>
+        </w:rPr>
+        <w:t xml:space="preserve"> </w:t>
+      </w:r>
+      <w:proofErr w:type="spellStart"/>
+      <w:r>
+        <w:rPr>
+          <w:rFonts w:ascii="Aptos" w:hAnsi="Aptos"/>
+          <w:sz w:val="24"/>
+          <w:szCs w:val="24"/>
+        </w:rPr>
+        <w:t>must</w:t>
+      </w:r>
+      <w:proofErr w:type="spellEnd"/>
+      <w:r>
+        <w:rPr>
+          <w:rFonts w:ascii="Aptos" w:hAnsi="Aptos"/>
+          <w:sz w:val="24"/>
+          <w:szCs w:val="24"/>
+        </w:rPr>
+        <w:t xml:space="preserve"> </w:t>
+      </w:r>
+      <w:proofErr w:type="spellStart"/>
+      <w:r>
+        <w:rPr>
+          <w:rFonts w:ascii="Aptos" w:hAnsi="Aptos"/>
+          <w:sz w:val="24"/>
+          <w:szCs w:val="24"/>
+        </w:rPr>
+        <w:t>satisfy</w:t>
+      </w:r>
+      <w:proofErr w:type="spellEnd"/>
+      <w:r>
+        <w:rPr>
+          <w:rFonts w:ascii="Aptos" w:hAnsi="Aptos"/>
+          <w:sz w:val="24"/>
+          <w:szCs w:val="24"/>
+        </w:rPr>
+        <w:t xml:space="preserve"> </w:t>
+      </w:r>
+      <w:proofErr w:type="spellStart"/>
+      <w:r>
+        <w:rPr>
+          <w:rFonts w:ascii="Aptos" w:hAnsi="Aptos"/>
+          <w:sz w:val="24"/>
+          <w:szCs w:val="24"/>
+        </w:rPr>
+        <w:t>and</w:t>
+      </w:r>
+      <w:proofErr w:type="spellEnd"/>
+      <w:r>
+        <w:rPr>
+          <w:rFonts w:ascii="Aptos" w:hAnsi="Aptos"/>
+          <w:sz w:val="24"/>
+          <w:szCs w:val="24"/>
+        </w:rPr>
+        <w:t xml:space="preserve"> </w:t>
+      </w:r>
+      <w:proofErr w:type="spellStart"/>
+      <w:r>
+        <w:rPr>
+          <w:rFonts w:ascii="Aptos" w:hAnsi="Aptos"/>
+          <w:sz w:val="24"/>
+          <w:szCs w:val="24"/>
+        </w:rPr>
+        <w:t>t</w:t>
+      </w:r>
+      <w:r>
+        <w:rPr>
+          <w:rFonts w:ascii="Aptos" w:hAnsi="Aptos"/>
+          <w:sz w:val="24"/>
+          <w:szCs w:val="24"/>
+        </w:rPr>
+        <w:t>he</w:t>
+      </w:r>
+      <w:proofErr w:type="spellEnd"/>
+      <w:r>
+        <w:rPr>
+          <w:rFonts w:ascii="Aptos" w:hAnsi="Aptos"/>
+          <w:sz w:val="24"/>
+          <w:szCs w:val="24"/>
+        </w:rPr>
+        <w:t xml:space="preserve"> </w:t>
+      </w:r>
+      <w:proofErr w:type="spellStart"/>
+      <w:r>
+        <w:rPr>
+          <w:rFonts w:ascii="Aptos" w:hAnsi="Aptos"/>
+          <w:sz w:val="24"/>
+          <w:szCs w:val="24"/>
+        </w:rPr>
+        <w:t>acceptance</w:t>
+      </w:r>
+      <w:proofErr w:type="spellEnd"/>
+      <w:r>
+        <w:rPr>
+          <w:rFonts w:ascii="Aptos" w:hAnsi="Aptos"/>
+          <w:sz w:val="24"/>
+          <w:szCs w:val="24"/>
+        </w:rPr>
+        <w:t xml:space="preserve"> test</w:t>
+      </w:r>
+      <w:r>
+        <w:rPr>
+          <w:rFonts w:ascii="Aptos" w:hAnsi="Aptos"/>
+          <w:sz w:val="24"/>
+          <w:szCs w:val="24"/>
+        </w:rPr>
+        <w:t xml:space="preserve">. </w:t>
+      </w:r>
+      <w:proofErr w:type="spellStart"/>
+      <w:r>
+        <w:rPr>
+          <w:rFonts w:ascii="Aptos" w:hAnsi="Aptos"/>
+          <w:sz w:val="24"/>
+          <w:szCs w:val="24"/>
+        </w:rPr>
+        <w:t>All</w:t>
+      </w:r>
+      <w:proofErr w:type="spellEnd"/>
+      <w:r>
+        <w:rPr>
+          <w:rFonts w:ascii="Aptos" w:hAnsi="Aptos"/>
+          <w:sz w:val="24"/>
+          <w:szCs w:val="24"/>
+        </w:rPr>
+        <w:t xml:space="preserve"> </w:t>
+      </w:r>
+      <w:proofErr w:type="spellStart"/>
+      <w:r>
+        <w:rPr>
+          <w:rFonts w:ascii="Aptos" w:hAnsi="Aptos"/>
+          <w:sz w:val="24"/>
+          <w:szCs w:val="24"/>
+        </w:rPr>
+        <w:t>tests</w:t>
+      </w:r>
+      <w:proofErr w:type="spellEnd"/>
+      <w:r>
+        <w:rPr>
+          <w:rFonts w:ascii="Aptos" w:hAnsi="Aptos"/>
+          <w:sz w:val="24"/>
+          <w:szCs w:val="24"/>
+        </w:rPr>
+        <w:t xml:space="preserve"> </w:t>
+      </w:r>
+      <w:proofErr w:type="spellStart"/>
+      <w:r>
+        <w:rPr>
+          <w:rFonts w:ascii="Aptos" w:hAnsi="Aptos"/>
+          <w:sz w:val="24"/>
+          <w:szCs w:val="24"/>
+        </w:rPr>
+        <w:t>are</w:t>
+      </w:r>
+      <w:proofErr w:type="spellEnd"/>
+      <w:r>
+        <w:rPr>
+          <w:rFonts w:ascii="Aptos" w:hAnsi="Aptos"/>
+          <w:sz w:val="24"/>
+          <w:szCs w:val="24"/>
+        </w:rPr>
+        <w:t xml:space="preserve"> </w:t>
+      </w:r>
+      <w:proofErr w:type="spellStart"/>
+      <w:r>
+        <w:rPr>
+          <w:rFonts w:ascii="Aptos" w:hAnsi="Aptos"/>
+          <w:sz w:val="24"/>
+          <w:szCs w:val="24"/>
+        </w:rPr>
+        <w:t>designed</w:t>
+      </w:r>
+      <w:proofErr w:type="spellEnd"/>
+      <w:r>
+        <w:rPr>
+          <w:rFonts w:ascii="Aptos" w:hAnsi="Aptos"/>
+          <w:sz w:val="24"/>
+          <w:szCs w:val="24"/>
+        </w:rPr>
+        <w:t xml:space="preserve"> </w:t>
+      </w:r>
+      <w:proofErr w:type="spellStart"/>
+      <w:r>
+        <w:rPr>
+          <w:rFonts w:ascii="Aptos" w:hAnsi="Aptos"/>
+          <w:sz w:val="24"/>
+          <w:szCs w:val="24"/>
+        </w:rPr>
+        <w:t>to</w:t>
+      </w:r>
+      <w:proofErr w:type="spellEnd"/>
+      <w:r>
+        <w:rPr>
+          <w:rFonts w:ascii="Aptos" w:hAnsi="Aptos"/>
+          <w:sz w:val="24"/>
+          <w:szCs w:val="24"/>
+        </w:rPr>
+        <w:t xml:space="preserve"> </w:t>
+      </w:r>
+      <w:proofErr w:type="spellStart"/>
+      <w:r>
+        <w:rPr>
+          <w:rFonts w:ascii="Aptos" w:hAnsi="Aptos"/>
+          <w:sz w:val="24"/>
+          <w:szCs w:val="24"/>
+        </w:rPr>
+        <w:t>validate</w:t>
+      </w:r>
+      <w:proofErr w:type="spellEnd"/>
+      <w:r>
+        <w:rPr>
+          <w:rFonts w:ascii="Aptos" w:hAnsi="Aptos"/>
+          <w:sz w:val="24"/>
+          <w:szCs w:val="24"/>
+        </w:rPr>
+        <w:t xml:space="preserve"> of </w:t>
+      </w:r>
+      <w:proofErr w:type="spellStart"/>
+      <w:r>
+        <w:rPr>
+          <w:rFonts w:ascii="Aptos" w:hAnsi="Aptos"/>
+          <w:sz w:val="24"/>
+          <w:szCs w:val="24"/>
+        </w:rPr>
+        <w:t>the</w:t>
+      </w:r>
+      <w:proofErr w:type="spellEnd"/>
+      <w:r>
+        <w:rPr>
+          <w:rFonts w:ascii="Aptos" w:hAnsi="Aptos"/>
+          <w:sz w:val="24"/>
+          <w:szCs w:val="24"/>
+        </w:rPr>
+        <w:t xml:space="preserve"> </w:t>
+      </w:r>
+      <w:proofErr w:type="spellStart"/>
+      <w:r>
+        <w:rPr>
+          <w:rFonts w:ascii="Aptos" w:hAnsi="Aptos"/>
+          <w:sz w:val="24"/>
+          <w:szCs w:val="24"/>
+        </w:rPr>
+        <w:t>application</w:t>
+      </w:r>
+      <w:proofErr w:type="spellEnd"/>
+      <w:r>
+        <w:rPr>
+          <w:rFonts w:ascii="Aptos" w:hAnsi="Aptos"/>
+          <w:sz w:val="24"/>
+          <w:szCs w:val="24"/>
+        </w:rPr>
+        <w:t>.</w:t>
+      </w:r>
+    </w:p>
+    <w:p>
+      <w:pPr>
+        <w:spacing w:before="100" w:beforeAutospacing="1" w:after="100" w:afterAutospacing="1" w:line="240" w:lineRule="auto"/>
+        <w:outlineLvl w:val="1"/>
+        <w:rPr>
+          <w:rFonts w:ascii="Aptos" w:eastAsia="Times New Roman" w:hAnsi="Aptos" w:cs="Times New Roman"/>
+          <w:b/>
+          <w:bCs/>
+          <w:color w:val="000000" w:themeColor="text1"/>
+          <w:sz w:val="36"/>
+          <w:szCs w:val="36"/>
+          <w:lang w:val="en-GB" w:eastAsia="tr-TR"/>
+        </w:rPr>
+      </w:pPr>
+    </w:p>
+    <w:p>
+      <w:pPr>
+        <w:spacing w:before="100" w:beforeAutospacing="1" w:after="100" w:afterAutospacing="1" w:line="240" w:lineRule="auto"/>
+        <w:outlineLvl w:val="1"/>
+        <w:rPr>
+          <w:rFonts w:ascii="Aptos" w:eastAsia="Times New Roman" w:hAnsi="Aptos" w:cs="Times New Roman"/>
+          <w:b/>
+          <w:bCs/>
+          <w:color w:val="000000" w:themeColor="text1"/>
+          <w:sz w:val="36"/>
+          <w:szCs w:val="36"/>
+          <w:lang w:val="en-GB" w:eastAsia="tr-TR"/>
+        </w:rPr>
+      </w:pPr>
+    </w:p>
+    <w:p>
+      <w:pPr>
+        <w:spacing w:before="100" w:beforeAutospacing="1" w:after="100" w:afterAutospacing="1" w:line="240" w:lineRule="auto"/>
+        <w:outlineLvl w:val="1"/>
+        <w:rPr>
+          <w:rFonts w:ascii="Aptos" w:eastAsia="Times New Roman" w:hAnsi="Aptos" w:cs="Times New Roman"/>
+          <w:b/>
+          <w:bCs/>
+          <w:color w:val="000000" w:themeColor="text1"/>
+          <w:sz w:val="36"/>
+          <w:szCs w:val="36"/>
+          <w:lang w:val="en-GB" w:eastAsia="tr-TR"/>
+        </w:rPr>
+      </w:pPr>
+    </w:p>
+    <w:p>
+      <w:pPr>
+        <w:spacing w:before="100" w:beforeAutospacing="1" w:after="100" w:afterAutospacing="1" w:line="240" w:lineRule="auto"/>
+        <w:outlineLvl w:val="1"/>
+        <w:rPr>
+          <w:rFonts w:ascii="Aptos" w:eastAsia="Times New Roman" w:hAnsi="Aptos" w:cs="Times New Roman"/>
+          <w:b/>
+          <w:bCs/>
+          <w:color w:val="000000" w:themeColor="text1"/>
+          <w:sz w:val="36"/>
+          <w:szCs w:val="36"/>
+          <w:lang w:val="en-GB" w:eastAsia="tr-TR"/>
+        </w:rPr>
+      </w:pPr>
+      <w:r>
+        <w:rPr>
+          <w:rFonts w:ascii="Aptos" w:eastAsia="Times New Roman" w:hAnsi="Aptos" w:cs="Times New Roman"/>
+          <w:b/>
+          <w:bCs/>
+          <w:color w:val="000000" w:themeColor="text1"/>
+          <w:sz w:val="36"/>
+          <w:szCs w:val="36"/>
+          <w:lang w:val="en-GB" w:eastAsia="tr-TR"/>
+        </w:rPr>
         <w:t xml:space="preserve">1. UC1: User Registration </w:t>
       </w:r>
     </w:p>
@@ -33,16 +1634,16 @@
       <w:pPr>
         <w:spacing w:before="100" w:beforeAutospacing="1" w:after="100" w:afterAutospacing="1" w:line="240" w:lineRule="auto"/>
         <w:rPr>
-          <w:rFonts w:ascii="Times New Roman" w:eastAsia="Times New Roman" w:hAnsi="Times New Roman" w:cs="Times New Roman"/>
-          <w:color w:val="000000" w:themeColor="text1"/>
-          <w:sz w:val="24"/>
-          <w:szCs w:val="24"/>
-          <w:lang w:val="en-GB" w:eastAsia="tr-TR"/>
-        </w:rPr>
-      </w:pPr>
-      <w:r>
-        <w:rPr>
-          <w:rFonts w:ascii="Times New Roman" w:eastAsia="Times New Roman" w:hAnsi="Times New Roman" w:cs="Times New Roman"/>
+          <w:rFonts w:ascii="Aptos" w:eastAsia="Times New Roman" w:hAnsi="Aptos" w:cs="Times New Roman"/>
+          <w:color w:val="000000" w:themeColor="text1"/>
+          <w:sz w:val="24"/>
+          <w:szCs w:val="24"/>
+          <w:lang w:val="en-GB" w:eastAsia="tr-TR"/>
+        </w:rPr>
+      </w:pPr>
+      <w:r>
+        <w:rPr>
+          <w:rFonts w:ascii="Aptos" w:eastAsia="Times New Roman" w:hAnsi="Aptos" w:cs="Times New Roman"/>
           <w:b/>
           <w:bCs/>
           <w:color w:val="000000" w:themeColor="text1"/>
@@ -61,16 +1662,16 @@
         </w:numPr>
         <w:spacing w:before="100" w:beforeAutospacing="1" w:after="100" w:afterAutospacing="1" w:line="240" w:lineRule="auto"/>
         <w:rPr>
-          <w:rFonts w:ascii="Times New Roman" w:eastAsia="Times New Roman" w:hAnsi="Times New Roman" w:cs="Times New Roman"/>
-          <w:color w:val="000000" w:themeColor="text1"/>
-          <w:sz w:val="24"/>
-          <w:szCs w:val="24"/>
-          <w:lang w:val="en-GB" w:eastAsia="tr-TR"/>
-        </w:rPr>
-      </w:pPr>
-      <w:r>
-        <w:rPr>
-          <w:rFonts w:ascii="Times New Roman" w:eastAsia="Times New Roman" w:hAnsi="Times New Roman" w:cs="Times New Roman"/>
+          <w:rFonts w:ascii="Aptos" w:eastAsia="Times New Roman" w:hAnsi="Aptos" w:cs="Times New Roman"/>
+          <w:color w:val="000000" w:themeColor="text1"/>
+          <w:sz w:val="24"/>
+          <w:szCs w:val="24"/>
+          <w:lang w:val="en-GB" w:eastAsia="tr-TR"/>
+        </w:rPr>
+      </w:pPr>
+      <w:r>
+        <w:rPr>
+          <w:rFonts w:ascii="Aptos" w:eastAsia="Times New Roman" w:hAnsi="Aptos" w:cs="Times New Roman"/>
           <w:color w:val="000000" w:themeColor="text1"/>
           <w:sz w:val="24"/>
           <w:szCs w:val="24"/>
@@ -87,16 +1688,16 @@
         </w:numPr>
         <w:spacing w:before="100" w:beforeAutospacing="1" w:after="100" w:afterAutospacing="1" w:line="240" w:lineRule="auto"/>
         <w:rPr>
-          <w:rFonts w:ascii="Times New Roman" w:eastAsia="Times New Roman" w:hAnsi="Times New Roman" w:cs="Times New Roman"/>
-          <w:color w:val="000000" w:themeColor="text1"/>
-          <w:sz w:val="24"/>
-          <w:szCs w:val="24"/>
-          <w:lang w:val="en-GB" w:eastAsia="tr-TR"/>
-        </w:rPr>
-      </w:pPr>
-      <w:r>
-        <w:rPr>
-          <w:rFonts w:ascii="Times New Roman" w:eastAsia="Times New Roman" w:hAnsi="Times New Roman" w:cs="Times New Roman"/>
+          <w:rFonts w:ascii="Aptos" w:eastAsia="Times New Roman" w:hAnsi="Aptos" w:cs="Times New Roman"/>
+          <w:color w:val="000000" w:themeColor="text1"/>
+          <w:sz w:val="24"/>
+          <w:szCs w:val="24"/>
+          <w:lang w:val="en-GB" w:eastAsia="tr-TR"/>
+        </w:rPr>
+      </w:pPr>
+      <w:r>
+        <w:rPr>
+          <w:rFonts w:ascii="Aptos" w:eastAsia="Times New Roman" w:hAnsi="Aptos" w:cs="Times New Roman"/>
           <w:color w:val="000000" w:themeColor="text1"/>
           <w:sz w:val="24"/>
           <w:szCs w:val="24"/>
@@ -107,7 +1708,7 @@
       <w:proofErr w:type="spellStart"/>
       <w:r>
         <w:rPr>
-          <w:rFonts w:ascii="Times New Roman" w:eastAsia="Times New Roman" w:hAnsi="Times New Roman" w:cs="Times New Roman"/>
+          <w:rFonts w:ascii="Aptos" w:eastAsia="Times New Roman" w:hAnsi="Aptos" w:cs="Times New Roman"/>
           <w:b/>
           <w:bCs/>
           <w:color w:val="000000" w:themeColor="text1"/>
@@ -120,7 +1721,7 @@
       <w:proofErr w:type="spellEnd"/>
       <w:r>
         <w:rPr>
-          <w:rFonts w:ascii="Times New Roman" w:eastAsia="Times New Roman" w:hAnsi="Times New Roman" w:cs="Times New Roman"/>
+          <w:rFonts w:ascii="Aptos" w:eastAsia="Times New Roman" w:hAnsi="Aptos" w:cs="Times New Roman"/>
           <w:color w:val="000000" w:themeColor="text1"/>
           <w:sz w:val="24"/>
           <w:szCs w:val="24"/>
@@ -137,16 +1738,16 @@
         </w:numPr>
         <w:spacing w:before="100" w:beforeAutospacing="1" w:after="100" w:afterAutospacing="1" w:line="240" w:lineRule="auto"/>
         <w:rPr>
-          <w:rFonts w:ascii="Times New Roman" w:eastAsia="Times New Roman" w:hAnsi="Times New Roman" w:cs="Times New Roman"/>
-          <w:color w:val="000000" w:themeColor="text1"/>
-          <w:sz w:val="24"/>
-          <w:szCs w:val="24"/>
-          <w:lang w:val="en-GB" w:eastAsia="tr-TR"/>
-        </w:rPr>
-      </w:pPr>
-      <w:r>
-        <w:rPr>
-          <w:rFonts w:ascii="Times New Roman" w:eastAsia="Times New Roman" w:hAnsi="Times New Roman" w:cs="Times New Roman"/>
+          <w:rFonts w:ascii="Aptos" w:eastAsia="Times New Roman" w:hAnsi="Aptos" w:cs="Times New Roman"/>
+          <w:color w:val="000000" w:themeColor="text1"/>
+          <w:sz w:val="24"/>
+          <w:szCs w:val="24"/>
+          <w:lang w:val="en-GB" w:eastAsia="tr-TR"/>
+        </w:rPr>
+      </w:pPr>
+      <w:r>
+        <w:rPr>
+          <w:rFonts w:ascii="Aptos" w:eastAsia="Times New Roman" w:hAnsi="Aptos" w:cs="Times New Roman"/>
           <w:color w:val="000000" w:themeColor="text1"/>
           <w:sz w:val="24"/>
           <w:szCs w:val="24"/>
@@ -157,7 +1758,7 @@
       <w:proofErr w:type="spellStart"/>
       <w:r>
         <w:rPr>
-          <w:rFonts w:ascii="Times New Roman" w:eastAsia="Times New Roman" w:hAnsi="Times New Roman" w:cs="Times New Roman"/>
+          <w:rFonts w:ascii="Aptos" w:eastAsia="Times New Roman" w:hAnsi="Aptos" w:cs="Times New Roman"/>
           <w:color w:val="000000" w:themeColor="text1"/>
           <w:sz w:val="24"/>
           <w:szCs w:val="24"/>
@@ -168,7 +1769,7 @@
       <w:proofErr w:type="spellEnd"/>
       <w:r>
         <w:rPr>
-          <w:rFonts w:ascii="Times New Roman" w:eastAsia="Times New Roman" w:hAnsi="Times New Roman" w:cs="Times New Roman"/>
+          <w:rFonts w:ascii="Aptos" w:eastAsia="Times New Roman" w:hAnsi="Aptos" w:cs="Times New Roman"/>
           <w:color w:val="000000" w:themeColor="text1"/>
           <w:sz w:val="24"/>
           <w:szCs w:val="24"/>
@@ -178,7 +1779,7 @@
       </w:r>
       <w:r>
         <w:rPr>
-          <w:rFonts w:ascii="Courier New" w:eastAsia="Times New Roman" w:hAnsi="Courier New" w:cs="Courier New"/>
+          <w:rFonts w:ascii="Aptos" w:eastAsia="Times New Roman" w:hAnsi="Aptos" w:cs="Courier New"/>
           <w:color w:val="000000" w:themeColor="text1"/>
           <w:sz w:val="20"/>
           <w:szCs w:val="20"/>
@@ -189,7 +1790,7 @@
       <w:proofErr w:type="spellStart"/>
       <w:r>
         <w:rPr>
-          <w:rFonts w:ascii="Courier New" w:eastAsia="Times New Roman" w:hAnsi="Courier New" w:cs="Courier New"/>
+          <w:rFonts w:ascii="Aptos" w:eastAsia="Times New Roman" w:hAnsi="Aptos" w:cs="Courier New"/>
           <w:color w:val="000000" w:themeColor="text1"/>
           <w:sz w:val="20"/>
           <w:szCs w:val="20"/>
@@ -200,7 +1801,7 @@
       <w:proofErr w:type="spellEnd"/>
       <w:r>
         <w:rPr>
-          <w:rFonts w:ascii="Courier New" w:eastAsia="Times New Roman" w:hAnsi="Courier New" w:cs="Courier New"/>
+          <w:rFonts w:ascii="Aptos" w:eastAsia="Times New Roman" w:hAnsi="Aptos" w:cs="Courier New"/>
           <w:color w:val="000000" w:themeColor="text1"/>
           <w:sz w:val="20"/>
           <w:szCs w:val="20"/>
@@ -210,7 +1811,7 @@
       </w:r>
       <w:r>
         <w:rPr>
-          <w:rFonts w:ascii="Times New Roman" w:eastAsia="Times New Roman" w:hAnsi="Times New Roman" w:cs="Times New Roman"/>
+          <w:rFonts w:ascii="Aptos" w:eastAsia="Times New Roman" w:hAnsi="Aptos" w:cs="Times New Roman"/>
           <w:color w:val="000000" w:themeColor="text1"/>
           <w:sz w:val="24"/>
           <w:szCs w:val="24"/>
@@ -223,16 +1824,16 @@
       <w:pPr>
         <w:spacing w:before="100" w:beforeAutospacing="1" w:after="100" w:afterAutospacing="1" w:line="240" w:lineRule="auto"/>
         <w:rPr>
-          <w:rFonts w:ascii="Times New Roman" w:eastAsia="Times New Roman" w:hAnsi="Times New Roman" w:cs="Times New Roman"/>
-          <w:color w:val="000000" w:themeColor="text1"/>
-          <w:sz w:val="24"/>
-          <w:szCs w:val="24"/>
-          <w:lang w:val="en-GB" w:eastAsia="tr-TR"/>
-        </w:rPr>
-      </w:pPr>
-      <w:r>
-        <w:rPr>
-          <w:rFonts w:ascii="Times New Roman" w:eastAsia="Times New Roman" w:hAnsi="Times New Roman" w:cs="Times New Roman"/>
+          <w:rFonts w:ascii="Aptos" w:eastAsia="Times New Roman" w:hAnsi="Aptos" w:cs="Times New Roman"/>
+          <w:color w:val="000000" w:themeColor="text1"/>
+          <w:sz w:val="24"/>
+          <w:szCs w:val="24"/>
+          <w:lang w:val="en-GB" w:eastAsia="tr-TR"/>
+        </w:rPr>
+      </w:pPr>
+      <w:r>
+        <w:rPr>
+          <w:rFonts w:ascii="Aptos" w:eastAsia="Times New Roman" w:hAnsi="Aptos" w:cs="Times New Roman"/>
           <w:b/>
           <w:bCs/>
           <w:color w:val="000000" w:themeColor="text1"/>
@@ -251,16 +1852,16 @@
         </w:numPr>
         <w:spacing w:before="100" w:beforeAutospacing="1" w:after="100" w:afterAutospacing="1" w:line="240" w:lineRule="auto"/>
         <w:rPr>
-          <w:rFonts w:ascii="Times New Roman" w:eastAsia="Times New Roman" w:hAnsi="Times New Roman" w:cs="Times New Roman"/>
-          <w:color w:val="000000" w:themeColor="text1"/>
-          <w:sz w:val="24"/>
-          <w:szCs w:val="24"/>
-          <w:lang w:val="en-GB" w:eastAsia="tr-TR"/>
-        </w:rPr>
-      </w:pPr>
-      <w:r>
-        <w:rPr>
-          <w:rFonts w:ascii="Times New Roman" w:eastAsia="Times New Roman" w:hAnsi="Times New Roman" w:cs="Times New Roman"/>
+          <w:rFonts w:ascii="Aptos" w:eastAsia="Times New Roman" w:hAnsi="Aptos" w:cs="Times New Roman"/>
+          <w:color w:val="000000" w:themeColor="text1"/>
+          <w:sz w:val="24"/>
+          <w:szCs w:val="24"/>
+          <w:lang w:val="en-GB" w:eastAsia="tr-TR"/>
+        </w:rPr>
+      </w:pPr>
+      <w:r>
+        <w:rPr>
+          <w:rFonts w:ascii="Aptos" w:eastAsia="Times New Roman" w:hAnsi="Aptos" w:cs="Times New Roman"/>
           <w:b/>
           <w:bCs/>
           <w:color w:val="000000" w:themeColor="text1"/>
@@ -272,7 +1873,7 @@
       </w:r>
       <w:r>
         <w:rPr>
-          <w:rFonts w:ascii="Times New Roman" w:eastAsia="Times New Roman" w:hAnsi="Times New Roman" w:cs="Times New Roman"/>
+          <w:rFonts w:ascii="Aptos" w:eastAsia="Times New Roman" w:hAnsi="Aptos" w:cs="Times New Roman"/>
           <w:color w:val="000000" w:themeColor="text1"/>
           <w:sz w:val="24"/>
           <w:szCs w:val="24"/>
@@ -282,7 +1883,7 @@
       </w:r>
       <w:r>
         <w:rPr>
-          <w:rFonts w:ascii="Courier New" w:eastAsia="Times New Roman" w:hAnsi="Courier New" w:cs="Courier New"/>
+          <w:rFonts w:ascii="Aptos" w:eastAsia="Times New Roman" w:hAnsi="Aptos" w:cs="Courier New"/>
           <w:color w:val="000000" w:themeColor="text1"/>
           <w:sz w:val="20"/>
           <w:szCs w:val="20"/>
@@ -292,7 +1893,7 @@
       </w:r>
       <w:r>
         <w:rPr>
-          <w:rFonts w:ascii="Times New Roman" w:eastAsia="Times New Roman" w:hAnsi="Times New Roman" w:cs="Times New Roman"/>
+          <w:rFonts w:ascii="Aptos" w:eastAsia="Times New Roman" w:hAnsi="Aptos" w:cs="Times New Roman"/>
           <w:color w:val="000000" w:themeColor="text1"/>
           <w:sz w:val="24"/>
           <w:szCs w:val="24"/>
@@ -309,16 +1910,16 @@
         </w:numPr>
         <w:spacing w:before="100" w:beforeAutospacing="1" w:after="100" w:afterAutospacing="1" w:line="240" w:lineRule="auto"/>
         <w:rPr>
-          <w:rFonts w:ascii="Times New Roman" w:eastAsia="Times New Roman" w:hAnsi="Times New Roman" w:cs="Times New Roman"/>
-          <w:color w:val="000000" w:themeColor="text1"/>
-          <w:sz w:val="24"/>
-          <w:szCs w:val="24"/>
-          <w:lang w:val="en-GB" w:eastAsia="tr-TR"/>
-        </w:rPr>
-      </w:pPr>
-      <w:r>
-        <w:rPr>
-          <w:rFonts w:ascii="Times New Roman" w:eastAsia="Times New Roman" w:hAnsi="Times New Roman" w:cs="Times New Roman"/>
+          <w:rFonts w:ascii="Aptos" w:eastAsia="Times New Roman" w:hAnsi="Aptos" w:cs="Times New Roman"/>
+          <w:color w:val="000000" w:themeColor="text1"/>
+          <w:sz w:val="24"/>
+          <w:szCs w:val="24"/>
+          <w:lang w:val="en-GB" w:eastAsia="tr-TR"/>
+        </w:rPr>
+      </w:pPr>
+      <w:r>
+        <w:rPr>
+          <w:rFonts w:ascii="Aptos" w:eastAsia="Times New Roman" w:hAnsi="Aptos" w:cs="Times New Roman"/>
           <w:b/>
           <w:bCs/>
           <w:color w:val="000000" w:themeColor="text1"/>
@@ -330,7 +1931,7 @@
       </w:r>
       <w:r>
         <w:rPr>
-          <w:rFonts w:ascii="Times New Roman" w:eastAsia="Times New Roman" w:hAnsi="Times New Roman" w:cs="Times New Roman"/>
+          <w:rFonts w:ascii="Aptos" w:eastAsia="Times New Roman" w:hAnsi="Aptos" w:cs="Times New Roman"/>
           <w:color w:val="000000" w:themeColor="text1"/>
           <w:sz w:val="24"/>
           <w:szCs w:val="24"/>
@@ -340,7 +1941,7 @@
       </w:r>
       <w:r>
         <w:rPr>
-          <w:rFonts w:ascii="Times New Roman" w:eastAsia="Times New Roman" w:hAnsi="Times New Roman" w:cs="Times New Roman"/>
+          <w:rFonts w:ascii="Aptos" w:eastAsia="Times New Roman" w:hAnsi="Aptos" w:cs="Times New Roman"/>
           <w:color w:val="000000" w:themeColor="text1"/>
           <w:sz w:val="24"/>
           <w:szCs w:val="24"/>
@@ -350,7 +1951,7 @@
       </w:r>
       <w:r>
         <w:rPr>
-          <w:rFonts w:ascii="Times New Roman" w:eastAsia="Times New Roman" w:hAnsi="Times New Roman" w:cs="Times New Roman"/>
+          <w:rFonts w:ascii="Aptos" w:eastAsia="Times New Roman" w:hAnsi="Aptos" w:cs="Times New Roman"/>
           <w:color w:val="000000" w:themeColor="text1"/>
           <w:sz w:val="24"/>
           <w:szCs w:val="24"/>
@@ -363,7 +1964,7 @@
       <w:pPr>
         <w:spacing w:after="0" w:line="240" w:lineRule="auto"/>
         <w:rPr>
-          <w:rFonts w:ascii="Times New Roman" w:eastAsia="Times New Roman" w:hAnsi="Times New Roman" w:cs="Times New Roman"/>
+          <w:rFonts w:ascii="Aptos" w:eastAsia="Times New Roman" w:hAnsi="Aptos" w:cs="Times New Roman"/>
           <w:color w:val="000000" w:themeColor="text1"/>
           <w:sz w:val="24"/>
           <w:szCs w:val="24"/>
@@ -376,7 +1977,7 @@
         <w:spacing w:before="100" w:beforeAutospacing="1" w:after="100" w:afterAutospacing="1" w:line="240" w:lineRule="auto"/>
         <w:outlineLvl w:val="1"/>
         <w:rPr>
-          <w:rFonts w:ascii="Times New Roman" w:eastAsia="Times New Roman" w:hAnsi="Times New Roman" w:cs="Times New Roman"/>
+          <w:rFonts w:ascii="Aptos" w:eastAsia="Times New Roman" w:hAnsi="Aptos" w:cs="Times New Roman"/>
           <w:b/>
           <w:bCs/>
           <w:color w:val="000000" w:themeColor="text1"/>
@@ -387,7 +1988,7 @@
       </w:pPr>
       <w:r>
         <w:rPr>
-          <w:rFonts w:ascii="Times New Roman" w:eastAsia="Times New Roman" w:hAnsi="Times New Roman" w:cs="Times New Roman"/>
+          <w:rFonts w:ascii="Aptos" w:eastAsia="Times New Roman" w:hAnsi="Aptos" w:cs="Times New Roman"/>
           <w:b/>
           <w:bCs/>
           <w:color w:val="000000" w:themeColor="text1"/>
@@ -402,16 +2003,16 @@
       <w:pPr>
         <w:spacing w:before="100" w:beforeAutospacing="1" w:after="100" w:afterAutospacing="1" w:line="240" w:lineRule="auto"/>
         <w:rPr>
-          <w:rFonts w:ascii="Times New Roman" w:eastAsia="Times New Roman" w:hAnsi="Times New Roman" w:cs="Times New Roman"/>
-          <w:color w:val="000000" w:themeColor="text1"/>
-          <w:sz w:val="24"/>
-          <w:szCs w:val="24"/>
-          <w:lang w:val="en-GB" w:eastAsia="tr-TR"/>
-        </w:rPr>
-      </w:pPr>
-      <w:r>
-        <w:rPr>
-          <w:rFonts w:ascii="Times New Roman" w:eastAsia="Times New Roman" w:hAnsi="Times New Roman" w:cs="Times New Roman"/>
+          <w:rFonts w:ascii="Aptos" w:eastAsia="Times New Roman" w:hAnsi="Aptos" w:cs="Times New Roman"/>
+          <w:color w:val="000000" w:themeColor="text1"/>
+          <w:sz w:val="24"/>
+          <w:szCs w:val="24"/>
+          <w:lang w:val="en-GB" w:eastAsia="tr-TR"/>
+        </w:rPr>
+      </w:pPr>
+      <w:r>
+        <w:rPr>
+          <w:rFonts w:ascii="Aptos" w:eastAsia="Times New Roman" w:hAnsi="Aptos" w:cs="Times New Roman"/>
           <w:b/>
           <w:bCs/>
           <w:color w:val="000000" w:themeColor="text1"/>
@@ -430,16 +2031,16 @@
         </w:numPr>
         <w:spacing w:before="100" w:beforeAutospacing="1" w:after="100" w:afterAutospacing="1" w:line="240" w:lineRule="auto"/>
         <w:rPr>
-          <w:rFonts w:ascii="Times New Roman" w:eastAsia="Times New Roman" w:hAnsi="Times New Roman" w:cs="Times New Roman"/>
-          <w:color w:val="000000" w:themeColor="text1"/>
-          <w:sz w:val="24"/>
-          <w:szCs w:val="24"/>
-          <w:lang w:val="en-GB" w:eastAsia="tr-TR"/>
-        </w:rPr>
-      </w:pPr>
-      <w:r>
-        <w:rPr>
-          <w:rFonts w:ascii="Times New Roman" w:eastAsia="Times New Roman" w:hAnsi="Times New Roman" w:cs="Times New Roman"/>
+          <w:rFonts w:ascii="Aptos" w:eastAsia="Times New Roman" w:hAnsi="Aptos" w:cs="Times New Roman"/>
+          <w:color w:val="000000" w:themeColor="text1"/>
+          <w:sz w:val="24"/>
+          <w:szCs w:val="24"/>
+          <w:lang w:val="en-GB" w:eastAsia="tr-TR"/>
+        </w:rPr>
+      </w:pPr>
+      <w:r>
+        <w:rPr>
+          <w:rFonts w:ascii="Aptos" w:eastAsia="Times New Roman" w:hAnsi="Aptos" w:cs="Times New Roman"/>
           <w:color w:val="000000" w:themeColor="text1"/>
           <w:sz w:val="24"/>
           <w:szCs w:val="24"/>
@@ -449,7 +2050,7 @@
       </w:r>
       <w:r>
         <w:rPr>
-          <w:rFonts w:ascii="Times New Roman" w:eastAsia="Times New Roman" w:hAnsi="Times New Roman" w:cs="Times New Roman"/>
+          <w:rFonts w:ascii="Aptos" w:eastAsia="Times New Roman" w:hAnsi="Aptos" w:cs="Times New Roman"/>
           <w:b/>
           <w:bCs/>
           <w:color w:val="000000" w:themeColor="text1"/>
@@ -462,7 +2063,7 @@
       <w:proofErr w:type="spellStart"/>
       <w:r>
         <w:rPr>
-          <w:rFonts w:ascii="Times New Roman" w:eastAsia="Times New Roman" w:hAnsi="Times New Roman" w:cs="Times New Roman"/>
+          <w:rFonts w:ascii="Aptos" w:eastAsia="Times New Roman" w:hAnsi="Aptos" w:cs="Times New Roman"/>
           <w:b/>
           <w:bCs/>
           <w:color w:val="000000" w:themeColor="text1"/>
@@ -475,7 +2076,7 @@
       <w:proofErr w:type="spellEnd"/>
       <w:r>
         <w:rPr>
-          <w:rFonts w:ascii="Times New Roman" w:eastAsia="Times New Roman" w:hAnsi="Times New Roman" w:cs="Times New Roman"/>
+          <w:rFonts w:ascii="Aptos" w:eastAsia="Times New Roman" w:hAnsi="Aptos" w:cs="Times New Roman"/>
           <w:b/>
           <w:bCs/>
           <w:color w:val="000000" w:themeColor="text1"/>
@@ -487,7 +2088,7 @@
       </w:r>
       <w:r>
         <w:rPr>
-          <w:rFonts w:ascii="Times New Roman" w:eastAsia="Times New Roman" w:hAnsi="Times New Roman" w:cs="Times New Roman"/>
+          <w:rFonts w:ascii="Aptos" w:eastAsia="Times New Roman" w:hAnsi="Aptos" w:cs="Times New Roman"/>
           <w:color w:val="000000" w:themeColor="text1"/>
           <w:sz w:val="24"/>
           <w:szCs w:val="24"/>
@@ -504,27 +2105,28 @@
         </w:numPr>
         <w:spacing w:before="100" w:beforeAutospacing="1" w:after="100" w:afterAutospacing="1" w:line="240" w:lineRule="auto"/>
         <w:rPr>
-          <w:rFonts w:ascii="Times New Roman" w:eastAsia="Times New Roman" w:hAnsi="Times New Roman" w:cs="Times New Roman"/>
-          <w:color w:val="000000" w:themeColor="text1"/>
-          <w:sz w:val="24"/>
-          <w:szCs w:val="24"/>
-          <w:lang w:val="en-GB" w:eastAsia="tr-TR"/>
-        </w:rPr>
-      </w:pPr>
-      <w:r>
-        <w:rPr>
-          <w:rFonts w:ascii="Times New Roman" w:eastAsia="Times New Roman" w:hAnsi="Times New Roman" w:cs="Times New Roman"/>
-          <w:color w:val="000000" w:themeColor="text1"/>
-          <w:sz w:val="24"/>
-          <w:szCs w:val="24"/>
-          <w:lang w:val="en-GB" w:eastAsia="tr-TR"/>
-        </w:rPr>
+          <w:rFonts w:ascii="Aptos" w:eastAsia="Times New Roman" w:hAnsi="Aptos" w:cs="Times New Roman"/>
+          <w:color w:val="000000" w:themeColor="text1"/>
+          <w:sz w:val="24"/>
+          <w:szCs w:val="24"/>
+          <w:lang w:val="en-GB" w:eastAsia="tr-TR"/>
+        </w:rPr>
+      </w:pPr>
+      <w:r>
+        <w:rPr>
+          <w:rFonts w:ascii="Aptos" w:eastAsia="Times New Roman" w:hAnsi="Aptos" w:cs="Times New Roman"/>
+          <w:color w:val="000000" w:themeColor="text1"/>
+          <w:sz w:val="24"/>
+          <w:szCs w:val="24"/>
+          <w:lang w:val="en-GB" w:eastAsia="tr-TR"/>
+        </w:rPr>
+        <w:lastRenderedPageBreak/>
         <w:t xml:space="preserve">The UI must communicate exclusively with the </w:t>
       </w:r>
       <w:proofErr w:type="spellStart"/>
       <w:r>
         <w:rPr>
-          <w:rFonts w:ascii="Times New Roman" w:eastAsia="Times New Roman" w:hAnsi="Times New Roman" w:cs="Times New Roman"/>
+          <w:rFonts w:ascii="Aptos" w:eastAsia="Times New Roman" w:hAnsi="Aptos" w:cs="Times New Roman"/>
           <w:b/>
           <w:bCs/>
           <w:color w:val="000000" w:themeColor="text1"/>
@@ -537,7 +2139,7 @@
       <w:proofErr w:type="spellEnd"/>
       <w:r>
         <w:rPr>
-          <w:rFonts w:ascii="Times New Roman" w:eastAsia="Times New Roman" w:hAnsi="Times New Roman" w:cs="Times New Roman"/>
+          <w:rFonts w:ascii="Aptos" w:eastAsia="Times New Roman" w:hAnsi="Aptos" w:cs="Times New Roman"/>
           <w:color w:val="000000" w:themeColor="text1"/>
           <w:sz w:val="24"/>
           <w:szCs w:val="24"/>
@@ -554,16 +2156,16 @@
         </w:numPr>
         <w:spacing w:before="100" w:beforeAutospacing="1" w:after="100" w:afterAutospacing="1" w:line="240" w:lineRule="auto"/>
         <w:rPr>
-          <w:rFonts w:ascii="Times New Roman" w:eastAsia="Times New Roman" w:hAnsi="Times New Roman" w:cs="Times New Roman"/>
-          <w:color w:val="000000" w:themeColor="text1"/>
-          <w:sz w:val="24"/>
-          <w:szCs w:val="24"/>
-          <w:lang w:val="en-GB" w:eastAsia="tr-TR"/>
-        </w:rPr>
-      </w:pPr>
-      <w:r>
-        <w:rPr>
-          <w:rFonts w:ascii="Times New Roman" w:eastAsia="Times New Roman" w:hAnsi="Times New Roman" w:cs="Times New Roman"/>
+          <w:rFonts w:ascii="Aptos" w:eastAsia="Times New Roman" w:hAnsi="Aptos" w:cs="Times New Roman"/>
+          <w:color w:val="000000" w:themeColor="text1"/>
+          <w:sz w:val="24"/>
+          <w:szCs w:val="24"/>
+          <w:lang w:val="en-GB" w:eastAsia="tr-TR"/>
+        </w:rPr>
+      </w:pPr>
+      <w:r>
+        <w:rPr>
+          <w:rFonts w:ascii="Aptos" w:eastAsia="Times New Roman" w:hAnsi="Aptos" w:cs="Times New Roman"/>
           <w:color w:val="000000" w:themeColor="text1"/>
           <w:sz w:val="24"/>
           <w:szCs w:val="24"/>
@@ -574,7 +2176,7 @@
       <w:proofErr w:type="spellStart"/>
       <w:r>
         <w:rPr>
-          <w:rFonts w:ascii="Times New Roman" w:eastAsia="Times New Roman" w:hAnsi="Times New Roman" w:cs="Times New Roman"/>
+          <w:rFonts w:ascii="Aptos" w:eastAsia="Times New Roman" w:hAnsi="Aptos" w:cs="Times New Roman"/>
           <w:b/>
           <w:bCs/>
           <w:color w:val="000000" w:themeColor="text1"/>
@@ -587,7 +2189,7 @@
       <w:proofErr w:type="spellEnd"/>
       <w:r>
         <w:rPr>
-          <w:rFonts w:ascii="Times New Roman" w:eastAsia="Times New Roman" w:hAnsi="Times New Roman" w:cs="Times New Roman"/>
+          <w:rFonts w:ascii="Aptos" w:eastAsia="Times New Roman" w:hAnsi="Aptos" w:cs="Times New Roman"/>
           <w:b/>
           <w:bCs/>
           <w:color w:val="000000" w:themeColor="text1"/>
@@ -599,7 +2201,7 @@
       </w:r>
       <w:r>
         <w:rPr>
-          <w:rFonts w:ascii="Times New Roman" w:eastAsia="Times New Roman" w:hAnsi="Times New Roman" w:cs="Times New Roman"/>
+          <w:rFonts w:ascii="Aptos" w:eastAsia="Times New Roman" w:hAnsi="Aptos" w:cs="Times New Roman"/>
           <w:color w:val="000000" w:themeColor="text1"/>
           <w:sz w:val="24"/>
           <w:szCs w:val="24"/>
@@ -612,16 +2214,16 @@
       <w:pPr>
         <w:spacing w:before="100" w:beforeAutospacing="1" w:after="100" w:afterAutospacing="1" w:line="240" w:lineRule="auto"/>
         <w:rPr>
-          <w:rFonts w:ascii="Times New Roman" w:eastAsia="Times New Roman" w:hAnsi="Times New Roman" w:cs="Times New Roman"/>
-          <w:color w:val="000000" w:themeColor="text1"/>
-          <w:sz w:val="24"/>
-          <w:szCs w:val="24"/>
-          <w:lang w:val="en-GB" w:eastAsia="tr-TR"/>
-        </w:rPr>
-      </w:pPr>
-      <w:r>
-        <w:rPr>
-          <w:rFonts w:ascii="Times New Roman" w:eastAsia="Times New Roman" w:hAnsi="Times New Roman" w:cs="Times New Roman"/>
+          <w:rFonts w:ascii="Aptos" w:eastAsia="Times New Roman" w:hAnsi="Aptos" w:cs="Times New Roman"/>
+          <w:color w:val="000000" w:themeColor="text1"/>
+          <w:sz w:val="24"/>
+          <w:szCs w:val="24"/>
+          <w:lang w:val="en-GB" w:eastAsia="tr-TR"/>
+        </w:rPr>
+      </w:pPr>
+      <w:r>
+        <w:rPr>
+          <w:rFonts w:ascii="Aptos" w:eastAsia="Times New Roman" w:hAnsi="Aptos" w:cs="Times New Roman"/>
           <w:b/>
           <w:bCs/>
           <w:color w:val="000000" w:themeColor="text1"/>
@@ -633,33 +2235,19 @@
       </w:r>
       <w:r>
         <w:rPr>
-          <w:rFonts w:ascii="Times New Roman" w:eastAsia="Times New Roman" w:hAnsi="Times New Roman" w:cs="Times New Roman"/>
-          <w:b/>
-          <w:bCs/>
-          <w:color w:val="000000" w:themeColor="text1"/>
-          <w:sz w:val="24"/>
-          <w:szCs w:val="24"/>
-          <w:lang w:val="en-GB" w:eastAsia="tr-TR"/>
-        </w:rPr>
-        <w:t>(TC-01</w:t>
-      </w:r>
-      <w:bookmarkStart w:id="0" w:name="_GoBack"/>
-      <w:bookmarkEnd w:id="0"/>
-      <w:r>
-        <w:rPr>
-          <w:rFonts w:ascii="Times New Roman" w:eastAsia="Times New Roman" w:hAnsi="Times New Roman" w:cs="Times New Roman"/>
-          <w:b/>
-          <w:bCs/>
-          <w:color w:val="000000" w:themeColor="text1"/>
-          <w:sz w:val="24"/>
-          <w:szCs w:val="24"/>
-          <w:lang w:val="en-GB" w:eastAsia="tr-TR"/>
-        </w:rPr>
-        <w:t>)</w:t>
-      </w:r>
-      <w:r>
-        <w:rPr>
-          <w:rFonts w:ascii="Times New Roman" w:eastAsia="Times New Roman" w:hAnsi="Times New Roman" w:cs="Times New Roman"/>
+          <w:rFonts w:ascii="Aptos" w:eastAsia="Times New Roman" w:hAnsi="Aptos" w:cs="Times New Roman"/>
+          <w:b/>
+          <w:bCs/>
+          <w:color w:val="000000" w:themeColor="text1"/>
+          <w:sz w:val="24"/>
+          <w:szCs w:val="24"/>
+          <w:lang w:val="en-GB" w:eastAsia="tr-TR"/>
+        </w:rPr>
+        <w:t>(TC-01)</w:t>
+      </w:r>
+      <w:r>
+        <w:rPr>
+          <w:rFonts w:ascii="Aptos" w:eastAsia="Times New Roman" w:hAnsi="Aptos" w:cs="Times New Roman"/>
           <w:b/>
           <w:bCs/>
           <w:color w:val="000000" w:themeColor="text1"/>
@@ -678,16 +2266,16 @@
         </w:numPr>
         <w:spacing w:before="100" w:beforeAutospacing="1" w:after="100" w:afterAutospacing="1" w:line="240" w:lineRule="auto"/>
         <w:rPr>
-          <w:rFonts w:ascii="Times New Roman" w:eastAsia="Times New Roman" w:hAnsi="Times New Roman" w:cs="Times New Roman"/>
-          <w:color w:val="000000" w:themeColor="text1"/>
-          <w:sz w:val="24"/>
-          <w:szCs w:val="24"/>
-          <w:lang w:val="en-GB" w:eastAsia="tr-TR"/>
-        </w:rPr>
-      </w:pPr>
-      <w:r>
-        <w:rPr>
-          <w:rFonts w:ascii="Times New Roman" w:eastAsia="Times New Roman" w:hAnsi="Times New Roman" w:cs="Times New Roman"/>
+          <w:rFonts w:ascii="Aptos" w:eastAsia="Times New Roman" w:hAnsi="Aptos" w:cs="Times New Roman"/>
+          <w:color w:val="000000" w:themeColor="text1"/>
+          <w:sz w:val="24"/>
+          <w:szCs w:val="24"/>
+          <w:lang w:val="en-GB" w:eastAsia="tr-TR"/>
+        </w:rPr>
+      </w:pPr>
+      <w:r>
+        <w:rPr>
+          <w:rFonts w:ascii="Aptos" w:eastAsia="Times New Roman" w:hAnsi="Aptos" w:cs="Times New Roman"/>
           <w:b/>
           <w:bCs/>
           <w:color w:val="000000" w:themeColor="text1"/>
@@ -699,7 +2287,7 @@
       </w:r>
       <w:r>
         <w:rPr>
-          <w:rFonts w:ascii="Times New Roman" w:eastAsia="Times New Roman" w:hAnsi="Times New Roman" w:cs="Times New Roman"/>
+          <w:rFonts w:ascii="Aptos" w:eastAsia="Times New Roman" w:hAnsi="Aptos" w:cs="Times New Roman"/>
           <w:color w:val="000000" w:themeColor="text1"/>
           <w:sz w:val="24"/>
           <w:szCs w:val="24"/>
@@ -716,16 +2304,16 @@
         </w:numPr>
         <w:spacing w:before="100" w:beforeAutospacing="1" w:after="100" w:afterAutospacing="1" w:line="240" w:lineRule="auto"/>
         <w:rPr>
-          <w:rFonts w:ascii="Times New Roman" w:eastAsia="Times New Roman" w:hAnsi="Times New Roman" w:cs="Times New Roman"/>
-          <w:color w:val="000000" w:themeColor="text1"/>
-          <w:sz w:val="24"/>
-          <w:szCs w:val="24"/>
-          <w:lang w:val="en-GB" w:eastAsia="tr-TR"/>
-        </w:rPr>
-      </w:pPr>
-      <w:r>
-        <w:rPr>
-          <w:rFonts w:ascii="Times New Roman" w:eastAsia="Times New Roman" w:hAnsi="Times New Roman" w:cs="Times New Roman"/>
+          <w:rFonts w:ascii="Aptos" w:eastAsia="Times New Roman" w:hAnsi="Aptos" w:cs="Times New Roman"/>
+          <w:color w:val="000000" w:themeColor="text1"/>
+          <w:sz w:val="24"/>
+          <w:szCs w:val="24"/>
+          <w:lang w:val="en-GB" w:eastAsia="tr-TR"/>
+        </w:rPr>
+      </w:pPr>
+      <w:r>
+        <w:rPr>
+          <w:rFonts w:ascii="Aptos" w:eastAsia="Times New Roman" w:hAnsi="Aptos" w:cs="Times New Roman"/>
           <w:b/>
           <w:bCs/>
           <w:color w:val="000000" w:themeColor="text1"/>
@@ -737,7 +2325,7 @@
       </w:r>
       <w:r>
         <w:rPr>
-          <w:rFonts w:ascii="Times New Roman" w:eastAsia="Times New Roman" w:hAnsi="Times New Roman" w:cs="Times New Roman"/>
+          <w:rFonts w:ascii="Aptos" w:eastAsia="Times New Roman" w:hAnsi="Aptos" w:cs="Times New Roman"/>
           <w:color w:val="000000" w:themeColor="text1"/>
           <w:sz w:val="24"/>
           <w:szCs w:val="24"/>
@@ -750,7 +2338,7 @@
       <w:pPr>
         <w:spacing w:after="0" w:line="240" w:lineRule="auto"/>
         <w:rPr>
-          <w:rFonts w:ascii="Times New Roman" w:eastAsia="Times New Roman" w:hAnsi="Times New Roman" w:cs="Times New Roman"/>
+          <w:rFonts w:ascii="Aptos" w:eastAsia="Times New Roman" w:hAnsi="Aptos" w:cs="Times New Roman"/>
           <w:color w:val="000000" w:themeColor="text1"/>
           <w:sz w:val="24"/>
           <w:szCs w:val="24"/>
@@ -763,7 +2351,7 @@
         <w:spacing w:before="100" w:beforeAutospacing="1" w:after="100" w:afterAutospacing="1" w:line="240" w:lineRule="auto"/>
         <w:outlineLvl w:val="1"/>
         <w:rPr>
-          <w:rFonts w:ascii="Times New Roman" w:eastAsia="Times New Roman" w:hAnsi="Times New Roman" w:cs="Times New Roman"/>
+          <w:rFonts w:ascii="Aptos" w:eastAsia="Times New Roman" w:hAnsi="Aptos" w:cs="Times New Roman"/>
           <w:b/>
           <w:bCs/>
           <w:color w:val="000000" w:themeColor="text1"/>
@@ -774,7 +2362,7 @@
       </w:pPr>
       <w:r>
         <w:rPr>
-          <w:rFonts w:ascii="Times New Roman" w:eastAsia="Times New Roman" w:hAnsi="Times New Roman" w:cs="Times New Roman"/>
+          <w:rFonts w:ascii="Aptos" w:eastAsia="Times New Roman" w:hAnsi="Aptos" w:cs="Times New Roman"/>
           <w:b/>
           <w:bCs/>
           <w:color w:val="000000" w:themeColor="text1"/>
@@ -789,16 +2377,16 @@
       <w:pPr>
         <w:spacing w:before="100" w:beforeAutospacing="1" w:after="100" w:afterAutospacing="1" w:line="240" w:lineRule="auto"/>
         <w:rPr>
-          <w:rFonts w:ascii="Times New Roman" w:eastAsia="Times New Roman" w:hAnsi="Times New Roman" w:cs="Times New Roman"/>
-          <w:color w:val="000000" w:themeColor="text1"/>
-          <w:sz w:val="24"/>
-          <w:szCs w:val="24"/>
-          <w:lang w:val="en-GB" w:eastAsia="tr-TR"/>
-        </w:rPr>
-      </w:pPr>
-      <w:r>
-        <w:rPr>
-          <w:rFonts w:ascii="Times New Roman" w:eastAsia="Times New Roman" w:hAnsi="Times New Roman" w:cs="Times New Roman"/>
+          <w:rFonts w:ascii="Aptos" w:eastAsia="Times New Roman" w:hAnsi="Aptos" w:cs="Times New Roman"/>
+          <w:color w:val="000000" w:themeColor="text1"/>
+          <w:sz w:val="24"/>
+          <w:szCs w:val="24"/>
+          <w:lang w:val="en-GB" w:eastAsia="tr-TR"/>
+        </w:rPr>
+      </w:pPr>
+      <w:r>
+        <w:rPr>
+          <w:rFonts w:ascii="Aptos" w:eastAsia="Times New Roman" w:hAnsi="Aptos" w:cs="Times New Roman"/>
           <w:b/>
           <w:bCs/>
           <w:color w:val="000000" w:themeColor="text1"/>
@@ -817,16 +2405,16 @@
         </w:numPr>
         <w:spacing w:before="100" w:beforeAutospacing="1" w:after="100" w:afterAutospacing="1" w:line="240" w:lineRule="auto"/>
         <w:rPr>
-          <w:rFonts w:ascii="Times New Roman" w:eastAsia="Times New Roman" w:hAnsi="Times New Roman" w:cs="Times New Roman"/>
-          <w:color w:val="000000" w:themeColor="text1"/>
-          <w:sz w:val="24"/>
-          <w:szCs w:val="24"/>
-          <w:lang w:val="en-GB" w:eastAsia="tr-TR"/>
-        </w:rPr>
-      </w:pPr>
-      <w:r>
-        <w:rPr>
-          <w:rFonts w:ascii="Times New Roman" w:eastAsia="Times New Roman" w:hAnsi="Times New Roman" w:cs="Times New Roman"/>
+          <w:rFonts w:ascii="Aptos" w:eastAsia="Times New Roman" w:hAnsi="Aptos" w:cs="Times New Roman"/>
+          <w:color w:val="000000" w:themeColor="text1"/>
+          <w:sz w:val="24"/>
+          <w:szCs w:val="24"/>
+          <w:lang w:val="en-GB" w:eastAsia="tr-TR"/>
+        </w:rPr>
+      </w:pPr>
+      <w:r>
+        <w:rPr>
+          <w:rFonts w:ascii="Aptos" w:eastAsia="Times New Roman" w:hAnsi="Aptos" w:cs="Times New Roman"/>
           <w:b/>
           <w:bCs/>
           <w:color w:val="000000" w:themeColor="text1"/>
@@ -838,7 +2426,7 @@
       </w:r>
       <w:r>
         <w:rPr>
-          <w:rFonts w:ascii="Times New Roman" w:eastAsia="Times New Roman" w:hAnsi="Times New Roman" w:cs="Times New Roman"/>
+          <w:rFonts w:ascii="Aptos" w:eastAsia="Times New Roman" w:hAnsi="Aptos" w:cs="Times New Roman"/>
           <w:color w:val="000000" w:themeColor="text1"/>
           <w:sz w:val="24"/>
           <w:szCs w:val="24"/>
@@ -849,7 +2437,7 @@
       <w:proofErr w:type="spellStart"/>
       <w:r>
         <w:rPr>
-          <w:rFonts w:ascii="Times New Roman" w:eastAsia="Times New Roman" w:hAnsi="Times New Roman" w:cs="Times New Roman"/>
+          <w:rFonts w:ascii="Aptos" w:eastAsia="Times New Roman" w:hAnsi="Aptos" w:cs="Times New Roman"/>
           <w:b/>
           <w:bCs/>
           <w:color w:val="000000" w:themeColor="text1"/>
@@ -862,7 +2450,7 @@
       <w:proofErr w:type="spellEnd"/>
       <w:r>
         <w:rPr>
-          <w:rFonts w:ascii="Times New Roman" w:eastAsia="Times New Roman" w:hAnsi="Times New Roman" w:cs="Times New Roman"/>
+          <w:rFonts w:ascii="Aptos" w:eastAsia="Times New Roman" w:hAnsi="Aptos" w:cs="Times New Roman"/>
           <w:color w:val="000000" w:themeColor="text1"/>
           <w:sz w:val="24"/>
           <w:szCs w:val="24"/>
@@ -879,16 +2467,16 @@
         </w:numPr>
         <w:spacing w:before="100" w:beforeAutospacing="1" w:after="100" w:afterAutospacing="1" w:line="240" w:lineRule="auto"/>
         <w:rPr>
-          <w:rFonts w:ascii="Times New Roman" w:eastAsia="Times New Roman" w:hAnsi="Times New Roman" w:cs="Times New Roman"/>
-          <w:color w:val="000000" w:themeColor="text1"/>
-          <w:sz w:val="24"/>
-          <w:szCs w:val="24"/>
-          <w:lang w:val="en-GB" w:eastAsia="tr-TR"/>
-        </w:rPr>
-      </w:pPr>
-      <w:r>
-        <w:rPr>
-          <w:rFonts w:ascii="Times New Roman" w:eastAsia="Times New Roman" w:hAnsi="Times New Roman" w:cs="Times New Roman"/>
+          <w:rFonts w:ascii="Aptos" w:eastAsia="Times New Roman" w:hAnsi="Aptos" w:cs="Times New Roman"/>
+          <w:color w:val="000000" w:themeColor="text1"/>
+          <w:sz w:val="24"/>
+          <w:szCs w:val="24"/>
+          <w:lang w:val="en-GB" w:eastAsia="tr-TR"/>
+        </w:rPr>
+      </w:pPr>
+      <w:r>
+        <w:rPr>
+          <w:rFonts w:ascii="Aptos" w:eastAsia="Times New Roman" w:hAnsi="Aptos" w:cs="Times New Roman"/>
           <w:b/>
           <w:bCs/>
           <w:color w:val="000000" w:themeColor="text1"/>
@@ -900,7 +2488,7 @@
       </w:r>
       <w:r>
         <w:rPr>
-          <w:rFonts w:ascii="Times New Roman" w:eastAsia="Times New Roman" w:hAnsi="Times New Roman" w:cs="Times New Roman"/>
+          <w:rFonts w:ascii="Aptos" w:eastAsia="Times New Roman" w:hAnsi="Aptos" w:cs="Times New Roman"/>
           <w:color w:val="000000" w:themeColor="text1"/>
           <w:sz w:val="24"/>
           <w:szCs w:val="24"/>
@@ -910,7 +2498,7 @@
       </w:r>
       <w:r>
         <w:rPr>
-          <w:rFonts w:ascii="Times New Roman" w:eastAsia="Times New Roman" w:hAnsi="Times New Roman" w:cs="Times New Roman"/>
+          <w:rFonts w:ascii="Aptos" w:eastAsia="Times New Roman" w:hAnsi="Aptos" w:cs="Times New Roman"/>
           <w:b/>
           <w:bCs/>
           <w:color w:val="000000" w:themeColor="text1"/>
@@ -922,7 +2510,7 @@
       </w:r>
       <w:r>
         <w:rPr>
-          <w:rFonts w:ascii="Times New Roman" w:eastAsia="Times New Roman" w:hAnsi="Times New Roman" w:cs="Times New Roman"/>
+          <w:rFonts w:ascii="Aptos" w:eastAsia="Times New Roman" w:hAnsi="Aptos" w:cs="Times New Roman"/>
           <w:color w:val="000000" w:themeColor="text1"/>
           <w:sz w:val="24"/>
           <w:szCs w:val="24"/>
@@ -934,7 +2522,7 @@
       <w:proofErr w:type="gramStart"/>
       <w:r>
         <w:rPr>
-          <w:rFonts w:ascii="Courier New" w:eastAsia="Times New Roman" w:hAnsi="Courier New" w:cs="Courier New"/>
+          <w:rFonts w:ascii="Aptos" w:eastAsia="Times New Roman" w:hAnsi="Aptos" w:cs="Courier New"/>
           <w:color w:val="000000" w:themeColor="text1"/>
           <w:sz w:val="20"/>
           <w:szCs w:val="20"/>
@@ -945,7 +2533,7 @@
       <w:proofErr w:type="spellEnd"/>
       <w:r>
         <w:rPr>
-          <w:rFonts w:ascii="Courier New" w:eastAsia="Times New Roman" w:hAnsi="Courier New" w:cs="Courier New"/>
+          <w:rFonts w:ascii="Aptos" w:eastAsia="Times New Roman" w:hAnsi="Aptos" w:cs="Courier New"/>
           <w:color w:val="000000" w:themeColor="text1"/>
           <w:sz w:val="20"/>
           <w:szCs w:val="20"/>
@@ -956,7 +2544,7 @@
       <w:proofErr w:type="gramEnd"/>
       <w:r>
         <w:rPr>
-          <w:rFonts w:ascii="Courier New" w:eastAsia="Times New Roman" w:hAnsi="Courier New" w:cs="Courier New"/>
+          <w:rFonts w:ascii="Aptos" w:eastAsia="Times New Roman" w:hAnsi="Aptos" w:cs="Courier New"/>
           <w:color w:val="000000" w:themeColor="text1"/>
           <w:sz w:val="20"/>
           <w:szCs w:val="20"/>
@@ -966,7 +2554,7 @@
       </w:r>
       <w:r>
         <w:rPr>
-          <w:rFonts w:ascii="Times New Roman" w:eastAsia="Times New Roman" w:hAnsi="Times New Roman" w:cs="Times New Roman"/>
+          <w:rFonts w:ascii="Aptos" w:eastAsia="Times New Roman" w:hAnsi="Aptos" w:cs="Times New Roman"/>
           <w:color w:val="000000" w:themeColor="text1"/>
           <w:sz w:val="24"/>
           <w:szCs w:val="24"/>
@@ -983,29 +2571,28 @@
         </w:numPr>
         <w:spacing w:before="100" w:beforeAutospacing="1" w:after="100" w:afterAutospacing="1" w:line="240" w:lineRule="auto"/>
         <w:rPr>
-          <w:rFonts w:ascii="Times New Roman" w:eastAsia="Times New Roman" w:hAnsi="Times New Roman" w:cs="Times New Roman"/>
-          <w:color w:val="000000" w:themeColor="text1"/>
-          <w:sz w:val="24"/>
-          <w:szCs w:val="24"/>
-          <w:lang w:val="en-GB" w:eastAsia="tr-TR"/>
-        </w:rPr>
-      </w:pPr>
-      <w:r>
-        <w:rPr>
-          <w:rFonts w:ascii="Times New Roman" w:eastAsia="Times New Roman" w:hAnsi="Times New Roman" w:cs="Times New Roman"/>
-          <w:b/>
-          <w:bCs/>
-          <w:color w:val="000000" w:themeColor="text1"/>
-          <w:sz w:val="24"/>
-          <w:szCs w:val="24"/>
-          <w:lang w:val="en-GB" w:eastAsia="tr-TR"/>
-        </w:rPr>
-        <w:lastRenderedPageBreak/>
+          <w:rFonts w:ascii="Aptos" w:eastAsia="Times New Roman" w:hAnsi="Aptos" w:cs="Times New Roman"/>
+          <w:color w:val="000000" w:themeColor="text1"/>
+          <w:sz w:val="24"/>
+          <w:szCs w:val="24"/>
+          <w:lang w:val="en-GB" w:eastAsia="tr-TR"/>
+        </w:rPr>
+      </w:pPr>
+      <w:r>
+        <w:rPr>
+          <w:rFonts w:ascii="Aptos" w:eastAsia="Times New Roman" w:hAnsi="Aptos" w:cs="Times New Roman"/>
+          <w:b/>
+          <w:bCs/>
+          <w:color w:val="000000" w:themeColor="text1"/>
+          <w:sz w:val="24"/>
+          <w:szCs w:val="24"/>
+          <w:lang w:val="en-GB" w:eastAsia="tr-TR"/>
+        </w:rPr>
         <w:t>Reliability:</w:t>
       </w:r>
       <w:r>
         <w:rPr>
-          <w:rFonts w:ascii="Times New Roman" w:eastAsia="Times New Roman" w:hAnsi="Times New Roman" w:cs="Times New Roman"/>
+          <w:rFonts w:ascii="Aptos" w:eastAsia="Times New Roman" w:hAnsi="Aptos" w:cs="Times New Roman"/>
           <w:color w:val="000000" w:themeColor="text1"/>
           <w:sz w:val="24"/>
           <w:szCs w:val="24"/>
@@ -1016,7 +2603,7 @@
       <w:proofErr w:type="spellStart"/>
       <w:r>
         <w:rPr>
-          <w:rFonts w:ascii="Times New Roman" w:eastAsia="Times New Roman" w:hAnsi="Times New Roman" w:cs="Times New Roman"/>
+          <w:rFonts w:ascii="Aptos" w:eastAsia="Times New Roman" w:hAnsi="Aptos" w:cs="Times New Roman"/>
           <w:b/>
           <w:bCs/>
           <w:color w:val="000000" w:themeColor="text1"/>
@@ -1029,7 +2616,7 @@
       <w:proofErr w:type="spellEnd"/>
       <w:r>
         <w:rPr>
-          <w:rFonts w:ascii="Times New Roman" w:eastAsia="Times New Roman" w:hAnsi="Times New Roman" w:cs="Times New Roman"/>
+          <w:rFonts w:ascii="Aptos" w:eastAsia="Times New Roman" w:hAnsi="Aptos" w:cs="Times New Roman"/>
           <w:color w:val="000000" w:themeColor="text1"/>
           <w:sz w:val="24"/>
           <w:szCs w:val="24"/>
@@ -1042,16 +2629,16 @@
       <w:pPr>
         <w:spacing w:before="100" w:beforeAutospacing="1" w:after="100" w:afterAutospacing="1" w:line="240" w:lineRule="auto"/>
         <w:rPr>
-          <w:rFonts w:ascii="Times New Roman" w:eastAsia="Times New Roman" w:hAnsi="Times New Roman" w:cs="Times New Roman"/>
-          <w:color w:val="000000" w:themeColor="text1"/>
-          <w:sz w:val="24"/>
-          <w:szCs w:val="24"/>
-          <w:lang w:val="en-GB" w:eastAsia="tr-TR"/>
-        </w:rPr>
-      </w:pPr>
-      <w:r>
-        <w:rPr>
-          <w:rFonts w:ascii="Times New Roman" w:eastAsia="Times New Roman" w:hAnsi="Times New Roman" w:cs="Times New Roman"/>
+          <w:rFonts w:ascii="Aptos" w:eastAsia="Times New Roman" w:hAnsi="Aptos" w:cs="Times New Roman"/>
+          <w:color w:val="000000" w:themeColor="text1"/>
+          <w:sz w:val="24"/>
+          <w:szCs w:val="24"/>
+          <w:lang w:val="en-GB" w:eastAsia="tr-TR"/>
+        </w:rPr>
+      </w:pPr>
+      <w:r>
+        <w:rPr>
+          <w:rFonts w:ascii="Aptos" w:eastAsia="Times New Roman" w:hAnsi="Aptos" w:cs="Times New Roman"/>
           <w:b/>
           <w:bCs/>
           <w:color w:val="000000" w:themeColor="text1"/>
@@ -1070,16 +2657,16 @@
         </w:numPr>
         <w:spacing w:before="100" w:beforeAutospacing="1" w:after="100" w:afterAutospacing="1" w:line="240" w:lineRule="auto"/>
         <w:rPr>
-          <w:rFonts w:ascii="Times New Roman" w:eastAsia="Times New Roman" w:hAnsi="Times New Roman" w:cs="Times New Roman"/>
-          <w:color w:val="000000" w:themeColor="text1"/>
-          <w:sz w:val="24"/>
-          <w:szCs w:val="24"/>
-          <w:lang w:val="en-GB" w:eastAsia="tr-TR"/>
-        </w:rPr>
-      </w:pPr>
-      <w:r>
-        <w:rPr>
-          <w:rFonts w:ascii="Times New Roman" w:eastAsia="Times New Roman" w:hAnsi="Times New Roman" w:cs="Times New Roman"/>
+          <w:rFonts w:ascii="Aptos" w:eastAsia="Times New Roman" w:hAnsi="Aptos" w:cs="Times New Roman"/>
+          <w:color w:val="000000" w:themeColor="text1"/>
+          <w:sz w:val="24"/>
+          <w:szCs w:val="24"/>
+          <w:lang w:val="en-GB" w:eastAsia="tr-TR"/>
+        </w:rPr>
+      </w:pPr>
+      <w:r>
+        <w:rPr>
+          <w:rFonts w:ascii="Aptos" w:eastAsia="Times New Roman" w:hAnsi="Aptos" w:cs="Times New Roman"/>
           <w:b/>
           <w:bCs/>
           <w:color w:val="000000" w:themeColor="text1"/>
@@ -1091,7 +2678,7 @@
       </w:r>
       <w:r>
         <w:rPr>
-          <w:rFonts w:ascii="Times New Roman" w:eastAsia="Times New Roman" w:hAnsi="Times New Roman" w:cs="Times New Roman"/>
+          <w:rFonts w:ascii="Aptos" w:eastAsia="Times New Roman" w:hAnsi="Aptos" w:cs="Times New Roman"/>
           <w:color w:val="000000" w:themeColor="text1"/>
           <w:sz w:val="24"/>
           <w:szCs w:val="24"/>
@@ -1108,16 +2695,16 @@
         </w:numPr>
         <w:spacing w:before="100" w:beforeAutospacing="1" w:after="100" w:afterAutospacing="1" w:line="240" w:lineRule="auto"/>
         <w:rPr>
-          <w:rFonts w:ascii="Times New Roman" w:eastAsia="Times New Roman" w:hAnsi="Times New Roman" w:cs="Times New Roman"/>
-          <w:color w:val="000000" w:themeColor="text1"/>
-          <w:sz w:val="24"/>
-          <w:szCs w:val="24"/>
-          <w:lang w:val="en-GB" w:eastAsia="tr-TR"/>
-        </w:rPr>
-      </w:pPr>
-      <w:r>
-        <w:rPr>
-          <w:rFonts w:ascii="Times New Roman" w:eastAsia="Times New Roman" w:hAnsi="Times New Roman" w:cs="Times New Roman"/>
+          <w:rFonts w:ascii="Aptos" w:eastAsia="Times New Roman" w:hAnsi="Aptos" w:cs="Times New Roman"/>
+          <w:color w:val="000000" w:themeColor="text1"/>
+          <w:sz w:val="24"/>
+          <w:szCs w:val="24"/>
+          <w:lang w:val="en-GB" w:eastAsia="tr-TR"/>
+        </w:rPr>
+      </w:pPr>
+      <w:r>
+        <w:rPr>
+          <w:rFonts w:ascii="Aptos" w:eastAsia="Times New Roman" w:hAnsi="Aptos" w:cs="Times New Roman"/>
           <w:b/>
           <w:bCs/>
           <w:color w:val="000000" w:themeColor="text1"/>
@@ -1129,7 +2716,7 @@
       </w:r>
       <w:r>
         <w:rPr>
-          <w:rFonts w:ascii="Times New Roman" w:eastAsia="Times New Roman" w:hAnsi="Times New Roman" w:cs="Times New Roman"/>
+          <w:rFonts w:ascii="Aptos" w:eastAsia="Times New Roman" w:hAnsi="Aptos" w:cs="Times New Roman"/>
           <w:color w:val="000000" w:themeColor="text1"/>
           <w:sz w:val="24"/>
           <w:szCs w:val="24"/>
@@ -1142,7 +2729,7 @@
       <w:pPr>
         <w:spacing w:after="0" w:line="240" w:lineRule="auto"/>
         <w:rPr>
-          <w:rFonts w:ascii="Times New Roman" w:eastAsia="Times New Roman" w:hAnsi="Times New Roman" w:cs="Times New Roman"/>
+          <w:rFonts w:ascii="Aptos" w:eastAsia="Times New Roman" w:hAnsi="Aptos" w:cs="Times New Roman"/>
           <w:color w:val="000000" w:themeColor="text1"/>
           <w:sz w:val="24"/>
           <w:szCs w:val="24"/>
@@ -1155,7 +2742,7 @@
         <w:spacing w:before="100" w:beforeAutospacing="1" w:after="100" w:afterAutospacing="1" w:line="240" w:lineRule="auto"/>
         <w:outlineLvl w:val="1"/>
         <w:rPr>
-          <w:rFonts w:ascii="Times New Roman" w:eastAsia="Times New Roman" w:hAnsi="Times New Roman" w:cs="Times New Roman"/>
+          <w:rFonts w:ascii="Aptos" w:eastAsia="Times New Roman" w:hAnsi="Aptos" w:cs="Times New Roman"/>
           <w:b/>
           <w:bCs/>
           <w:color w:val="000000" w:themeColor="text1"/>
@@ -1166,7 +2753,7 @@
       </w:pPr>
       <w:r>
         <w:rPr>
-          <w:rFonts w:ascii="Times New Roman" w:eastAsia="Times New Roman" w:hAnsi="Times New Roman" w:cs="Times New Roman"/>
+          <w:rFonts w:ascii="Aptos" w:eastAsia="Times New Roman" w:hAnsi="Aptos" w:cs="Times New Roman"/>
           <w:b/>
           <w:bCs/>
           <w:color w:val="000000" w:themeColor="text1"/>
@@ -1174,23 +2761,47 @@
           <w:szCs w:val="36"/>
           <w:lang w:val="en-GB" w:eastAsia="tr-TR"/>
         </w:rPr>
-        <w:t>4. UC4: Providing Feedback &amp; Survey History</w:t>
+        <w:t xml:space="preserve">4. </w:t>
+      </w:r>
+      <w:r>
+        <w:rPr>
+          <w:rFonts w:ascii="Aptos" w:eastAsia="Times New Roman" w:hAnsi="Aptos" w:cs="Times New Roman"/>
+          <w:b/>
+          <w:bCs/>
+          <w:color w:val="000000" w:themeColor="text1"/>
+          <w:sz w:val="36"/>
+          <w:szCs w:val="36"/>
+          <w:lang w:val="en-GB" w:eastAsia="tr-TR"/>
+        </w:rPr>
+        <w:t xml:space="preserve">UC 3 &amp; </w:t>
+      </w:r>
+      <w:r>
+        <w:rPr>
+          <w:rFonts w:ascii="Aptos" w:eastAsia="Times New Roman" w:hAnsi="Aptos" w:cs="Times New Roman"/>
+          <w:b/>
+          <w:bCs/>
+          <w:color w:val="000000" w:themeColor="text1"/>
+          <w:sz w:val="36"/>
+          <w:szCs w:val="36"/>
+          <w:lang w:val="en-GB" w:eastAsia="tr-TR"/>
+        </w:rPr>
+        <w:t>UC4: Providing Feedback &amp; Survey History</w:t>
       </w:r>
     </w:p>
     <w:p>
       <w:pPr>
         <w:spacing w:before="100" w:beforeAutospacing="1" w:after="100" w:afterAutospacing="1" w:line="240" w:lineRule="auto"/>
         <w:rPr>
-          <w:rFonts w:ascii="Times New Roman" w:eastAsia="Times New Roman" w:hAnsi="Times New Roman" w:cs="Times New Roman"/>
-          <w:color w:val="000000" w:themeColor="text1"/>
-          <w:sz w:val="24"/>
-          <w:szCs w:val="24"/>
-          <w:lang w:val="en-GB" w:eastAsia="tr-TR"/>
-        </w:rPr>
-      </w:pPr>
-      <w:r>
-        <w:rPr>
-          <w:rFonts w:ascii="Times New Roman" w:eastAsia="Times New Roman" w:hAnsi="Times New Roman" w:cs="Times New Roman"/>
+          <w:rFonts w:ascii="Aptos" w:eastAsia="Times New Roman" w:hAnsi="Aptos" w:cs="Times New Roman"/>
+          <w:color w:val="000000" w:themeColor="text1"/>
+          <w:sz w:val="24"/>
+          <w:szCs w:val="24"/>
+          <w:lang w:val="en-GB" w:eastAsia="tr-TR"/>
+        </w:rPr>
+      </w:pPr>
+      <w:r>
+        <w:rPr>
+          <w:rFonts w:ascii="Aptos" w:eastAsia="Times New Roman" w:hAnsi="Aptos" w:cs="Times New Roman"/>
           <w:b/>
           <w:bCs/>
           <w:color w:val="000000" w:themeColor="text1"/>
@@ -1209,16 +2820,16 @@
         </w:numPr>
         <w:spacing w:before="100" w:beforeAutospacing="1" w:after="100" w:afterAutospacing="1" w:line="240" w:lineRule="auto"/>
         <w:rPr>
-          <w:rFonts w:ascii="Times New Roman" w:eastAsia="Times New Roman" w:hAnsi="Times New Roman" w:cs="Times New Roman"/>
-          <w:color w:val="000000" w:themeColor="text1"/>
-          <w:sz w:val="24"/>
-          <w:szCs w:val="24"/>
-          <w:lang w:val="en-GB" w:eastAsia="tr-TR"/>
-        </w:rPr>
-      </w:pPr>
-      <w:r>
-        <w:rPr>
-          <w:rFonts w:ascii="Times New Roman" w:eastAsia="Times New Roman" w:hAnsi="Times New Roman" w:cs="Times New Roman"/>
+          <w:rFonts w:ascii="Aptos" w:eastAsia="Times New Roman" w:hAnsi="Aptos" w:cs="Times New Roman"/>
+          <w:color w:val="000000" w:themeColor="text1"/>
+          <w:sz w:val="24"/>
+          <w:szCs w:val="24"/>
+          <w:lang w:val="en-GB" w:eastAsia="tr-TR"/>
+        </w:rPr>
+      </w:pPr>
+      <w:r>
+        <w:rPr>
+          <w:rFonts w:ascii="Aptos" w:eastAsia="Times New Roman" w:hAnsi="Aptos" w:cs="Times New Roman"/>
           <w:b/>
           <w:bCs/>
           <w:color w:val="000000" w:themeColor="text1"/>
@@ -1230,7 +2841,7 @@
       </w:r>
       <w:r>
         <w:rPr>
-          <w:rFonts w:ascii="Times New Roman" w:eastAsia="Times New Roman" w:hAnsi="Times New Roman" w:cs="Times New Roman"/>
+          <w:rFonts w:ascii="Aptos" w:eastAsia="Times New Roman" w:hAnsi="Aptos" w:cs="Times New Roman"/>
           <w:color w:val="000000" w:themeColor="text1"/>
           <w:sz w:val="24"/>
           <w:szCs w:val="24"/>
@@ -1247,16 +2858,16 @@
         </w:numPr>
         <w:spacing w:before="100" w:beforeAutospacing="1" w:after="100" w:afterAutospacing="1" w:line="240" w:lineRule="auto"/>
         <w:rPr>
-          <w:rFonts w:ascii="Times New Roman" w:eastAsia="Times New Roman" w:hAnsi="Times New Roman" w:cs="Times New Roman"/>
-          <w:color w:val="000000" w:themeColor="text1"/>
-          <w:sz w:val="24"/>
-          <w:szCs w:val="24"/>
-          <w:lang w:val="en-GB" w:eastAsia="tr-TR"/>
-        </w:rPr>
-      </w:pPr>
-      <w:r>
-        <w:rPr>
-          <w:rFonts w:ascii="Times New Roman" w:eastAsia="Times New Roman" w:hAnsi="Times New Roman" w:cs="Times New Roman"/>
+          <w:rFonts w:ascii="Aptos" w:eastAsia="Times New Roman" w:hAnsi="Aptos" w:cs="Times New Roman"/>
+          <w:color w:val="000000" w:themeColor="text1"/>
+          <w:sz w:val="24"/>
+          <w:szCs w:val="24"/>
+          <w:lang w:val="en-GB" w:eastAsia="tr-TR"/>
+        </w:rPr>
+      </w:pPr>
+      <w:r>
+        <w:rPr>
+          <w:rFonts w:ascii="Aptos" w:eastAsia="Times New Roman" w:hAnsi="Aptos" w:cs="Times New Roman"/>
           <w:b/>
           <w:bCs/>
           <w:color w:val="000000" w:themeColor="text1"/>
@@ -1268,7 +2879,7 @@
       </w:r>
       <w:r>
         <w:rPr>
-          <w:rFonts w:ascii="Times New Roman" w:eastAsia="Times New Roman" w:hAnsi="Times New Roman" w:cs="Times New Roman"/>
+          <w:rFonts w:ascii="Aptos" w:eastAsia="Times New Roman" w:hAnsi="Aptos" w:cs="Times New Roman"/>
           <w:color w:val="000000" w:themeColor="text1"/>
           <w:sz w:val="24"/>
           <w:szCs w:val="24"/>
@@ -1278,7 +2889,7 @@
       </w:r>
       <w:r>
         <w:rPr>
-          <w:rFonts w:ascii="Times New Roman" w:eastAsia="Times New Roman" w:hAnsi="Times New Roman" w:cs="Times New Roman"/>
+          <w:rFonts w:ascii="Aptos" w:eastAsia="Times New Roman" w:hAnsi="Aptos" w:cs="Times New Roman"/>
           <w:b/>
           <w:bCs/>
           <w:color w:val="000000" w:themeColor="text1"/>
@@ -1290,7 +2901,7 @@
       </w:r>
       <w:r>
         <w:rPr>
-          <w:rFonts w:ascii="Times New Roman" w:eastAsia="Times New Roman" w:hAnsi="Times New Roman" w:cs="Times New Roman"/>
+          <w:rFonts w:ascii="Aptos" w:eastAsia="Times New Roman" w:hAnsi="Aptos" w:cs="Times New Roman"/>
           <w:color w:val="000000" w:themeColor="text1"/>
           <w:sz w:val="24"/>
           <w:szCs w:val="24"/>
@@ -1307,16 +2918,16 @@
         </w:numPr>
         <w:spacing w:before="100" w:beforeAutospacing="1" w:after="100" w:afterAutospacing="1" w:line="240" w:lineRule="auto"/>
         <w:rPr>
-          <w:rFonts w:ascii="Times New Roman" w:eastAsia="Times New Roman" w:hAnsi="Times New Roman" w:cs="Times New Roman"/>
-          <w:color w:val="000000" w:themeColor="text1"/>
-          <w:sz w:val="24"/>
-          <w:szCs w:val="24"/>
-          <w:lang w:val="en-GB" w:eastAsia="tr-TR"/>
-        </w:rPr>
-      </w:pPr>
-      <w:r>
-        <w:rPr>
-          <w:rFonts w:ascii="Times New Roman" w:eastAsia="Times New Roman" w:hAnsi="Times New Roman" w:cs="Times New Roman"/>
+          <w:rFonts w:ascii="Aptos" w:eastAsia="Times New Roman" w:hAnsi="Aptos" w:cs="Times New Roman"/>
+          <w:color w:val="000000" w:themeColor="text1"/>
+          <w:sz w:val="24"/>
+          <w:szCs w:val="24"/>
+          <w:lang w:val="en-GB" w:eastAsia="tr-TR"/>
+        </w:rPr>
+      </w:pPr>
+      <w:r>
+        <w:rPr>
+          <w:rFonts w:ascii="Aptos" w:eastAsia="Times New Roman" w:hAnsi="Aptos" w:cs="Times New Roman"/>
           <w:b/>
           <w:bCs/>
           <w:color w:val="000000" w:themeColor="text1"/>
@@ -1328,7 +2939,7 @@
       </w:r>
       <w:r>
         <w:rPr>
-          <w:rFonts w:ascii="Times New Roman" w:eastAsia="Times New Roman" w:hAnsi="Times New Roman" w:cs="Times New Roman"/>
+          <w:rFonts w:ascii="Aptos" w:eastAsia="Times New Roman" w:hAnsi="Aptos" w:cs="Times New Roman"/>
           <w:color w:val="000000" w:themeColor="text1"/>
           <w:sz w:val="24"/>
           <w:szCs w:val="24"/>
@@ -1338,7 +2949,7 @@
       </w:r>
       <w:r>
         <w:rPr>
-          <w:rFonts w:ascii="Times New Roman" w:eastAsia="Times New Roman" w:hAnsi="Times New Roman" w:cs="Times New Roman"/>
+          <w:rFonts w:ascii="Aptos" w:eastAsia="Times New Roman" w:hAnsi="Aptos" w:cs="Times New Roman"/>
           <w:b/>
           <w:bCs/>
           <w:color w:val="000000" w:themeColor="text1"/>
@@ -1350,7 +2961,7 @@
       </w:r>
       <w:r>
         <w:rPr>
-          <w:rFonts w:ascii="Times New Roman" w:eastAsia="Times New Roman" w:hAnsi="Times New Roman" w:cs="Times New Roman"/>
+          <w:rFonts w:ascii="Aptos" w:eastAsia="Times New Roman" w:hAnsi="Aptos" w:cs="Times New Roman"/>
           <w:color w:val="000000" w:themeColor="text1"/>
           <w:sz w:val="24"/>
           <w:szCs w:val="24"/>
@@ -1360,7 +2971,7 @@
       </w:r>
       <w:r>
         <w:rPr>
-          <w:rFonts w:ascii="Times New Roman" w:eastAsia="Times New Roman" w:hAnsi="Times New Roman" w:cs="Times New Roman"/>
+          <w:rFonts w:ascii="Aptos" w:eastAsia="Times New Roman" w:hAnsi="Aptos" w:cs="Times New Roman"/>
           <w:b/>
           <w:bCs/>
           <w:color w:val="000000" w:themeColor="text1"/>
@@ -1372,7 +2983,7 @@
       </w:r>
       <w:r>
         <w:rPr>
-          <w:rFonts w:ascii="Times New Roman" w:eastAsia="Times New Roman" w:hAnsi="Times New Roman" w:cs="Times New Roman"/>
+          <w:rFonts w:ascii="Aptos" w:eastAsia="Times New Roman" w:hAnsi="Aptos" w:cs="Times New Roman"/>
           <w:color w:val="000000" w:themeColor="text1"/>
           <w:sz w:val="24"/>
           <w:szCs w:val="24"/>
@@ -1385,16 +2996,16 @@
       <w:pPr>
         <w:spacing w:before="100" w:beforeAutospacing="1" w:after="100" w:afterAutospacing="1" w:line="240" w:lineRule="auto"/>
         <w:rPr>
-          <w:rFonts w:ascii="Times New Roman" w:eastAsia="Times New Roman" w:hAnsi="Times New Roman" w:cs="Times New Roman"/>
-          <w:color w:val="000000" w:themeColor="text1"/>
-          <w:sz w:val="24"/>
-          <w:szCs w:val="24"/>
-          <w:lang w:val="en-GB" w:eastAsia="tr-TR"/>
-        </w:rPr>
-      </w:pPr>
-      <w:r>
-        <w:rPr>
-          <w:rFonts w:ascii="Times New Roman" w:eastAsia="Times New Roman" w:hAnsi="Times New Roman" w:cs="Times New Roman"/>
+          <w:rFonts w:ascii="Aptos" w:eastAsia="Times New Roman" w:hAnsi="Aptos" w:cs="Times New Roman"/>
+          <w:color w:val="000000" w:themeColor="text1"/>
+          <w:sz w:val="24"/>
+          <w:szCs w:val="24"/>
+          <w:lang w:val="en-GB" w:eastAsia="tr-TR"/>
+        </w:rPr>
+      </w:pPr>
+      <w:r>
+        <w:rPr>
+          <w:rFonts w:ascii="Aptos" w:eastAsia="Times New Roman" w:hAnsi="Aptos" w:cs="Times New Roman"/>
           <w:b/>
           <w:bCs/>
           <w:color w:val="000000" w:themeColor="text1"/>
@@ -1413,16 +3024,16 @@
         </w:numPr>
         <w:spacing w:before="100" w:beforeAutospacing="1" w:after="100" w:afterAutospacing="1" w:line="240" w:lineRule="auto"/>
         <w:rPr>
-          <w:rFonts w:ascii="Times New Roman" w:eastAsia="Times New Roman" w:hAnsi="Times New Roman" w:cs="Times New Roman"/>
-          <w:color w:val="000000" w:themeColor="text1"/>
-          <w:sz w:val="24"/>
-          <w:szCs w:val="24"/>
-          <w:lang w:val="en-GB" w:eastAsia="tr-TR"/>
-        </w:rPr>
-      </w:pPr>
-      <w:r>
-        <w:rPr>
-          <w:rFonts w:ascii="Times New Roman" w:eastAsia="Times New Roman" w:hAnsi="Times New Roman" w:cs="Times New Roman"/>
+          <w:rFonts w:ascii="Aptos" w:eastAsia="Times New Roman" w:hAnsi="Aptos" w:cs="Times New Roman"/>
+          <w:color w:val="000000" w:themeColor="text1"/>
+          <w:sz w:val="24"/>
+          <w:szCs w:val="24"/>
+          <w:lang w:val="en-GB" w:eastAsia="tr-TR"/>
+        </w:rPr>
+      </w:pPr>
+      <w:r>
+        <w:rPr>
+          <w:rFonts w:ascii="Aptos" w:eastAsia="Times New Roman" w:hAnsi="Aptos" w:cs="Times New Roman"/>
           <w:b/>
           <w:bCs/>
           <w:color w:val="000000" w:themeColor="text1"/>
@@ -1434,7 +3045,7 @@
       </w:r>
       <w:r>
         <w:rPr>
-          <w:rFonts w:ascii="Times New Roman" w:eastAsia="Times New Roman" w:hAnsi="Times New Roman" w:cs="Times New Roman"/>
+          <w:rFonts w:ascii="Aptos" w:eastAsia="Times New Roman" w:hAnsi="Aptos" w:cs="Times New Roman"/>
           <w:color w:val="000000" w:themeColor="text1"/>
           <w:sz w:val="24"/>
           <w:szCs w:val="24"/>
@@ -1444,7 +3055,7 @@
       </w:r>
       <w:r>
         <w:rPr>
-          <w:rFonts w:ascii="Times New Roman" w:eastAsia="Times New Roman" w:hAnsi="Times New Roman" w:cs="Times New Roman"/>
+          <w:rFonts w:ascii="Aptos" w:eastAsia="Times New Roman" w:hAnsi="Aptos" w:cs="Times New Roman"/>
           <w:color w:val="000000" w:themeColor="text1"/>
           <w:sz w:val="24"/>
           <w:szCs w:val="24"/>
@@ -1461,28 +3072,29 @@
         </w:numPr>
         <w:spacing w:before="100" w:beforeAutospacing="1" w:after="100" w:afterAutospacing="1" w:line="240" w:lineRule="auto"/>
         <w:rPr>
-          <w:rFonts w:ascii="Times New Roman" w:eastAsia="Times New Roman" w:hAnsi="Times New Roman" w:cs="Times New Roman"/>
-          <w:color w:val="000000" w:themeColor="text1"/>
-          <w:sz w:val="24"/>
-          <w:szCs w:val="24"/>
-          <w:lang w:val="en-GB" w:eastAsia="tr-TR"/>
-        </w:rPr>
-      </w:pPr>
-      <w:r>
-        <w:rPr>
-          <w:rFonts w:ascii="Times New Roman" w:eastAsia="Times New Roman" w:hAnsi="Times New Roman" w:cs="Times New Roman"/>
-          <w:b/>
-          <w:bCs/>
-          <w:color w:val="000000" w:themeColor="text1"/>
-          <w:sz w:val="24"/>
-          <w:szCs w:val="24"/>
-          <w:lang w:val="en-GB" w:eastAsia="tr-TR"/>
-        </w:rPr>
+          <w:rFonts w:ascii="Aptos" w:eastAsia="Times New Roman" w:hAnsi="Aptos" w:cs="Times New Roman"/>
+          <w:color w:val="000000" w:themeColor="text1"/>
+          <w:sz w:val="24"/>
+          <w:szCs w:val="24"/>
+          <w:lang w:val="en-GB" w:eastAsia="tr-TR"/>
+        </w:rPr>
+      </w:pPr>
+      <w:r>
+        <w:rPr>
+          <w:rFonts w:ascii="Aptos" w:eastAsia="Times New Roman" w:hAnsi="Aptos" w:cs="Times New Roman"/>
+          <w:b/>
+          <w:bCs/>
+          <w:color w:val="000000" w:themeColor="text1"/>
+          <w:sz w:val="24"/>
+          <w:szCs w:val="24"/>
+          <w:lang w:val="en-GB" w:eastAsia="tr-TR"/>
+        </w:rPr>
+        <w:lastRenderedPageBreak/>
         <w:t>Expected Result:</w:t>
       </w:r>
       <w:r>
         <w:rPr>
-          <w:rFonts w:ascii="Times New Roman" w:eastAsia="Times New Roman" w:hAnsi="Times New Roman" w:cs="Times New Roman"/>
+          <w:rFonts w:ascii="Aptos" w:eastAsia="Times New Roman" w:hAnsi="Aptos" w:cs="Times New Roman"/>
           <w:color w:val="000000" w:themeColor="text1"/>
           <w:sz w:val="24"/>
           <w:szCs w:val="24"/>
@@ -1494,6 +3106,388 @@
     <w:p>
       <w:pPr>
         <w:rPr>
+          <w:rFonts w:ascii="Aptos" w:hAnsi="Aptos"/>
+          <w:lang w:val="en-GB"/>
+        </w:rPr>
+      </w:pPr>
+    </w:p>
+    <w:p>
+      <w:pPr>
+        <w:pStyle w:val="font-claude-response-body"/>
+        <w:rPr>
+          <w:rFonts w:ascii="Aptos" w:hAnsi="Aptos"/>
+        </w:rPr>
+      </w:pPr>
+      <w:proofErr w:type="spellStart"/>
+      <w:r>
+        <w:rPr>
+          <w:rStyle w:val="Gl"/>
+          <w:rFonts w:ascii="Aptos" w:hAnsi="Aptos"/>
+        </w:rPr>
+        <w:t>Conclusion</w:t>
+      </w:r>
+      <w:proofErr w:type="spellEnd"/>
+    </w:p>
+    <w:p>
+      <w:pPr>
+        <w:pStyle w:val="font-claude-response-body"/>
+        <w:rPr>
+          <w:rFonts w:ascii="Aptos" w:hAnsi="Aptos"/>
+        </w:rPr>
+      </w:pPr>
+      <w:proofErr w:type="spellStart"/>
+      <w:r>
+        <w:rPr>
+          <w:rFonts w:ascii="Aptos" w:hAnsi="Aptos"/>
+        </w:rPr>
+        <w:t>This</w:t>
+      </w:r>
+      <w:proofErr w:type="spellEnd"/>
+      <w:r>
+        <w:rPr>
+          <w:rFonts w:ascii="Aptos" w:hAnsi="Aptos"/>
+        </w:rPr>
+        <w:t xml:space="preserve"> </w:t>
+      </w:r>
+      <w:proofErr w:type="spellStart"/>
+      <w:r>
+        <w:rPr>
+          <w:rFonts w:ascii="Aptos" w:hAnsi="Aptos"/>
+        </w:rPr>
+        <w:t>document</w:t>
+      </w:r>
+      <w:proofErr w:type="spellEnd"/>
+      <w:r>
+        <w:rPr>
+          <w:rFonts w:ascii="Aptos" w:hAnsi="Aptos"/>
+        </w:rPr>
+        <w:t xml:space="preserve"> has </w:t>
+      </w:r>
+      <w:proofErr w:type="spellStart"/>
+      <w:r>
+        <w:rPr>
+          <w:rFonts w:ascii="Aptos" w:hAnsi="Aptos"/>
+        </w:rPr>
+        <w:t>defined</w:t>
+      </w:r>
+      <w:proofErr w:type="spellEnd"/>
+      <w:r>
+        <w:rPr>
+          <w:rFonts w:ascii="Aptos" w:hAnsi="Aptos"/>
+        </w:rPr>
+        <w:t xml:space="preserve"> </w:t>
+      </w:r>
+      <w:proofErr w:type="spellStart"/>
+      <w:r>
+        <w:rPr>
+          <w:rFonts w:ascii="Aptos" w:hAnsi="Aptos"/>
+        </w:rPr>
+        <w:t>the</w:t>
+      </w:r>
+      <w:proofErr w:type="spellEnd"/>
+      <w:r>
+        <w:rPr>
+          <w:rFonts w:ascii="Aptos" w:hAnsi="Aptos"/>
+        </w:rPr>
+        <w:t xml:space="preserve"> </w:t>
+      </w:r>
+      <w:proofErr w:type="spellStart"/>
+      <w:r>
+        <w:rPr>
+          <w:rFonts w:ascii="Aptos" w:hAnsi="Aptos"/>
+        </w:rPr>
+        <w:t>acceptance</w:t>
+      </w:r>
+      <w:proofErr w:type="spellEnd"/>
+      <w:r>
+        <w:rPr>
+          <w:rFonts w:ascii="Aptos" w:hAnsi="Aptos"/>
+        </w:rPr>
+        <w:t xml:space="preserve"> </w:t>
+      </w:r>
+      <w:proofErr w:type="spellStart"/>
+      <w:r>
+        <w:rPr>
+          <w:rFonts w:ascii="Aptos" w:hAnsi="Aptos"/>
+        </w:rPr>
+        <w:t>criteria</w:t>
+      </w:r>
+      <w:proofErr w:type="spellEnd"/>
+      <w:r>
+        <w:rPr>
+          <w:rFonts w:ascii="Aptos" w:hAnsi="Aptos"/>
+        </w:rPr>
+        <w:t xml:space="preserve"> </w:t>
+      </w:r>
+      <w:proofErr w:type="spellStart"/>
+      <w:r>
+        <w:rPr>
+          <w:rFonts w:ascii="Aptos" w:hAnsi="Aptos"/>
+        </w:rPr>
+        <w:t>and</w:t>
+      </w:r>
+      <w:proofErr w:type="spellEnd"/>
+      <w:r>
+        <w:rPr>
+          <w:rFonts w:ascii="Aptos" w:hAnsi="Aptos"/>
+        </w:rPr>
+        <w:t xml:space="preserve"> </w:t>
+      </w:r>
+      <w:proofErr w:type="spellStart"/>
+      <w:r>
+        <w:rPr>
+          <w:rFonts w:ascii="Aptos" w:hAnsi="Aptos"/>
+        </w:rPr>
+        <w:t>acceptance</w:t>
+      </w:r>
+      <w:proofErr w:type="spellEnd"/>
+      <w:r>
+        <w:rPr>
+          <w:rFonts w:ascii="Aptos" w:hAnsi="Aptos"/>
+        </w:rPr>
+        <w:t xml:space="preserve"> </w:t>
+      </w:r>
+      <w:proofErr w:type="spellStart"/>
+      <w:r>
+        <w:rPr>
+          <w:rFonts w:ascii="Aptos" w:hAnsi="Aptos"/>
+        </w:rPr>
+        <w:t>tests</w:t>
+      </w:r>
+      <w:proofErr w:type="spellEnd"/>
+      <w:r>
+        <w:rPr>
+          <w:rFonts w:ascii="Aptos" w:hAnsi="Aptos"/>
+        </w:rPr>
+        <w:t xml:space="preserve"> </w:t>
+      </w:r>
+      <w:proofErr w:type="spellStart"/>
+      <w:r>
+        <w:rPr>
+          <w:rFonts w:ascii="Aptos" w:hAnsi="Aptos"/>
+        </w:rPr>
+        <w:t>for</w:t>
+      </w:r>
+      <w:proofErr w:type="spellEnd"/>
+      <w:r>
+        <w:rPr>
+          <w:rFonts w:ascii="Aptos" w:hAnsi="Aptos"/>
+        </w:rPr>
+        <w:t xml:space="preserve"> </w:t>
+      </w:r>
+      <w:proofErr w:type="spellStart"/>
+      <w:r>
+        <w:rPr>
+          <w:rFonts w:ascii="Aptos" w:hAnsi="Aptos"/>
+        </w:rPr>
+        <w:t>the</w:t>
+      </w:r>
+      <w:proofErr w:type="spellEnd"/>
+      <w:r>
+        <w:rPr>
+          <w:rFonts w:ascii="Aptos" w:hAnsi="Aptos"/>
+        </w:rPr>
+        <w:t xml:space="preserve"> </w:t>
+      </w:r>
+      <w:proofErr w:type="spellStart"/>
+      <w:r>
+        <w:rPr>
+          <w:rFonts w:ascii="Aptos" w:hAnsi="Aptos"/>
+        </w:rPr>
+        <w:t>four</w:t>
+      </w:r>
+      <w:proofErr w:type="spellEnd"/>
+      <w:r>
+        <w:rPr>
+          <w:rFonts w:ascii="Aptos" w:hAnsi="Aptos"/>
+        </w:rPr>
+        <w:t xml:space="preserve"> </w:t>
+      </w:r>
+      <w:proofErr w:type="spellStart"/>
+      <w:r>
+        <w:rPr>
+          <w:rFonts w:ascii="Aptos" w:hAnsi="Aptos"/>
+        </w:rPr>
+        <w:t>core</w:t>
+      </w:r>
+      <w:proofErr w:type="spellEnd"/>
+      <w:r>
+        <w:rPr>
+          <w:rFonts w:ascii="Aptos" w:hAnsi="Aptos"/>
+        </w:rPr>
+        <w:t xml:space="preserve"> </w:t>
+      </w:r>
+      <w:proofErr w:type="spellStart"/>
+      <w:r>
+        <w:rPr>
+          <w:rFonts w:ascii="Aptos" w:hAnsi="Aptos"/>
+        </w:rPr>
+        <w:t>use</w:t>
+      </w:r>
+      <w:proofErr w:type="spellEnd"/>
+      <w:r>
+        <w:rPr>
+          <w:rFonts w:ascii="Aptos" w:hAnsi="Aptos"/>
+        </w:rPr>
+        <w:t xml:space="preserve"> </w:t>
+      </w:r>
+      <w:proofErr w:type="spellStart"/>
+      <w:r>
+        <w:rPr>
+          <w:rFonts w:ascii="Aptos" w:hAnsi="Aptos"/>
+        </w:rPr>
+        <w:t>cases</w:t>
+      </w:r>
+      <w:proofErr w:type="spellEnd"/>
+      <w:r>
+        <w:rPr>
+          <w:rFonts w:ascii="Aptos" w:hAnsi="Aptos"/>
+        </w:rPr>
+        <w:t xml:space="preserve"> of </w:t>
+      </w:r>
+      <w:proofErr w:type="spellStart"/>
+      <w:r>
+        <w:rPr>
+          <w:rFonts w:ascii="Aptos" w:hAnsi="Aptos"/>
+        </w:rPr>
+        <w:t>the</w:t>
+      </w:r>
+      <w:proofErr w:type="spellEnd"/>
+      <w:r>
+        <w:rPr>
+          <w:rFonts w:ascii="Aptos" w:hAnsi="Aptos"/>
+        </w:rPr>
+        <w:t xml:space="preserve"> </w:t>
+      </w:r>
+      <w:proofErr w:type="spellStart"/>
+      <w:r>
+        <w:rPr>
+          <w:rFonts w:ascii="Aptos" w:hAnsi="Aptos"/>
+        </w:rPr>
+        <w:t>application</w:t>
+      </w:r>
+      <w:proofErr w:type="spellEnd"/>
+      <w:r>
+        <w:rPr>
+          <w:rFonts w:ascii="Aptos" w:hAnsi="Aptos"/>
+        </w:rPr>
+        <w:t xml:space="preserve">: User </w:t>
+      </w:r>
+      <w:proofErr w:type="spellStart"/>
+      <w:r>
+        <w:rPr>
+          <w:rFonts w:ascii="Aptos" w:hAnsi="Aptos"/>
+        </w:rPr>
+        <w:t>Registration</w:t>
+      </w:r>
+      <w:proofErr w:type="spellEnd"/>
+      <w:r>
+        <w:rPr>
+          <w:rFonts w:ascii="Aptos" w:hAnsi="Aptos"/>
+        </w:rPr>
+        <w:t xml:space="preserve"> (UC1), User </w:t>
+      </w:r>
+      <w:proofErr w:type="spellStart"/>
+      <w:r>
+        <w:rPr>
+          <w:rFonts w:ascii="Aptos" w:hAnsi="Aptos"/>
+        </w:rPr>
+        <w:t>Login</w:t>
+      </w:r>
+      <w:proofErr w:type="spellEnd"/>
+      <w:r>
+        <w:rPr>
+          <w:rFonts w:ascii="Aptos" w:hAnsi="Aptos"/>
+        </w:rPr>
+        <w:t xml:space="preserve"> (UC2), Daily </w:t>
+      </w:r>
+      <w:proofErr w:type="spellStart"/>
+      <w:r>
+        <w:rPr>
+          <w:rFonts w:ascii="Aptos" w:hAnsi="Aptos"/>
+        </w:rPr>
+        <w:t>Survey</w:t>
+      </w:r>
+      <w:proofErr w:type="spellEnd"/>
+      <w:r>
+        <w:rPr>
+          <w:rFonts w:ascii="Aptos" w:hAnsi="Aptos"/>
+        </w:rPr>
+        <w:t xml:space="preserve"> </w:t>
+      </w:r>
+      <w:proofErr w:type="spellStart"/>
+      <w:r>
+        <w:rPr>
+          <w:rFonts w:ascii="Aptos" w:hAnsi="Aptos"/>
+        </w:rPr>
+        <w:t>Submission</w:t>
+      </w:r>
+      <w:proofErr w:type="spellEnd"/>
+      <w:r>
+        <w:rPr>
+          <w:rFonts w:ascii="Aptos" w:hAnsi="Aptos"/>
+        </w:rPr>
+        <w:t xml:space="preserve"> &amp; </w:t>
+      </w:r>
+      <w:proofErr w:type="spellStart"/>
+      <w:r>
+        <w:rPr>
+          <w:rFonts w:ascii="Aptos" w:hAnsi="Aptos"/>
+        </w:rPr>
+        <w:t>Providing</w:t>
+      </w:r>
+      <w:proofErr w:type="spellEnd"/>
+      <w:r>
+        <w:rPr>
+          <w:rFonts w:ascii="Aptos" w:hAnsi="Aptos"/>
+        </w:rPr>
+        <w:t xml:space="preserve"> Feedback</w:t>
+      </w:r>
+      <w:r>
+        <w:rPr>
+          <w:rFonts w:ascii="Aptos" w:hAnsi="Aptos"/>
+        </w:rPr>
+        <w:t xml:space="preserve"> (UC3</w:t>
+      </w:r>
+      <w:r>
+        <w:rPr>
+          <w:rFonts w:ascii="Aptos" w:hAnsi="Aptos"/>
+        </w:rPr>
+        <w:t>) ,</w:t>
+      </w:r>
+      <w:proofErr w:type="spellStart"/>
+      <w:r>
+        <w:rPr>
+          <w:rFonts w:ascii="Aptos" w:hAnsi="Aptos"/>
+        </w:rPr>
+        <w:t>Survey</w:t>
+      </w:r>
+      <w:proofErr w:type="spellEnd"/>
+      <w:r>
+        <w:rPr>
+          <w:rFonts w:ascii="Aptos" w:hAnsi="Aptos"/>
+        </w:rPr>
+        <w:t xml:space="preserve"> </w:t>
+      </w:r>
+      <w:proofErr w:type="spellStart"/>
+      <w:r>
+        <w:rPr>
+          <w:rFonts w:ascii="Aptos" w:hAnsi="Aptos"/>
+        </w:rPr>
+        <w:t>History</w:t>
+      </w:r>
+      <w:proofErr w:type="spellEnd"/>
+      <w:r>
+        <w:rPr>
+          <w:rFonts w:ascii="Aptos" w:hAnsi="Aptos"/>
+        </w:rPr>
+        <w:t xml:space="preserve"> (UC4).</w:t>
+      </w:r>
+    </w:p>
+    <w:p>
+      <w:pPr>
+        <w:rPr>
+          <w:rFonts w:ascii="Aptos" w:hAnsi="Aptos"/>
           <w:lang w:val="en-GB"/>
         </w:rPr>
       </w:pPr>
@@ -1809,6 +3803,119 @@
     </w:lvl>
   </w:abstractNum>
   <w:abstractNum w:abstractNumId="2" w15:restartNumberingAfterBreak="0">
+    <w:nsid w:val="43D92C99"/>
+    <w:multiLevelType w:val="hybridMultilevel"/>
+    <w:tmpl w:val="60725AB4"/>
+    <w:lvl w:ilvl="0" w:tplc="041F0001">
+      <w:start w:val="1"/>
+      <w:numFmt w:val="bullet"/>
+      <w:lvlText w:val=""/>
+      <w:lvlJc w:val="left"/>
+      <w:pPr>
+        <w:ind w:left="720" w:hanging="360"/>
+      </w:pPr>
+      <w:rPr>
+        <w:rFonts w:ascii="Symbol" w:hAnsi="Symbol" w:hint="default"/>
+      </w:rPr>
+    </w:lvl>
+    <w:lvl w:ilvl="1" w:tplc="041F0003" w:tentative="1">
+      <w:start w:val="1"/>
+      <w:numFmt w:val="bullet"/>
+      <w:lvlText w:val="o"/>
+      <w:lvlJc w:val="left"/>
+      <w:pPr>
+        <w:ind w:left="1440" w:hanging="360"/>
+      </w:pPr>
+      <w:rPr>
+        <w:rFonts w:ascii="Courier New" w:hAnsi="Courier New" w:cs="Courier New" w:hint="default"/>
+      </w:rPr>
+    </w:lvl>
+    <w:lvl w:ilvl="2" w:tplc="041F0005" w:tentative="1">
+      <w:start w:val="1"/>
+      <w:numFmt w:val="bullet"/>
+      <w:lvlText w:val=""/>
+      <w:lvlJc w:val="left"/>
+      <w:pPr>
+        <w:ind w:left="2160" w:hanging="360"/>
+      </w:pPr>
+      <w:rPr>
+        <w:rFonts w:ascii="Wingdings" w:hAnsi="Wingdings" w:hint="default"/>
+      </w:rPr>
+    </w:lvl>
+    <w:lvl w:ilvl="3" w:tplc="041F0001" w:tentative="1">
+      <w:start w:val="1"/>
+      <w:numFmt w:val="bullet"/>
+      <w:lvlText w:val=""/>
+      <w:lvlJc w:val="left"/>
+      <w:pPr>
+        <w:ind w:left="2880" w:hanging="360"/>
+      </w:pPr>
+      <w:rPr>
+        <w:rFonts w:ascii="Symbol" w:hAnsi="Symbol" w:hint="default"/>
+      </w:rPr>
+    </w:lvl>
+    <w:lvl w:ilvl="4" w:tplc="041F0003" w:tentative="1">
+      <w:start w:val="1"/>
+      <w:numFmt w:val="bullet"/>
+      <w:lvlText w:val="o"/>
+      <w:lvlJc w:val="left"/>
+      <w:pPr>
+        <w:ind w:left="3600" w:hanging="360"/>
+      </w:pPr>
+      <w:rPr>
+        <w:rFonts w:ascii="Courier New" w:hAnsi="Courier New" w:cs="Courier New" w:hint="default"/>
+      </w:rPr>
+    </w:lvl>
+    <w:lvl w:ilvl="5" w:tplc="041F0005" w:tentative="1">
+      <w:start w:val="1"/>
+      <w:numFmt w:val="bullet"/>
+      <w:lvlText w:val=""/>
+      <w:lvlJc w:val="left"/>
+      <w:pPr>
+        <w:ind w:left="4320" w:hanging="360"/>
+      </w:pPr>
+      <w:rPr>
+        <w:rFonts w:ascii="Wingdings" w:hAnsi="Wingdings" w:hint="default"/>
+      </w:rPr>
+    </w:lvl>
+    <w:lvl w:ilvl="6" w:tplc="041F0001" w:tentative="1">
+      <w:start w:val="1"/>
+      <w:numFmt w:val="bullet"/>
+      <w:lvlText w:val=""/>
+      <w:lvlJc w:val="left"/>
+      <w:pPr>
+        <w:ind w:left="5040" w:hanging="360"/>
+      </w:pPr>
+      <w:rPr>
+        <w:rFonts w:ascii="Symbol" w:hAnsi="Symbol" w:hint="default"/>
+      </w:rPr>
+    </w:lvl>
+    <w:lvl w:ilvl="7" w:tplc="041F0003" w:tentative="1">
+      <w:start w:val="1"/>
+      <w:numFmt w:val="bullet"/>
+      <w:lvlText w:val="o"/>
+      <w:lvlJc w:val="left"/>
+      <w:pPr>
+        <w:ind w:left="5760" w:hanging="360"/>
+      </w:pPr>
+      <w:rPr>
+        <w:rFonts w:ascii="Courier New" w:hAnsi="Courier New" w:cs="Courier New" w:hint="default"/>
+      </w:rPr>
+    </w:lvl>
+    <w:lvl w:ilvl="8" w:tplc="041F0005" w:tentative="1">
+      <w:start w:val="1"/>
+      <w:numFmt w:val="bullet"/>
+      <w:lvlText w:val=""/>
+      <w:lvlJc w:val="left"/>
+      <w:pPr>
+        <w:ind w:left="6480" w:hanging="360"/>
+      </w:pPr>
+      <w:rPr>
+        <w:rFonts w:ascii="Wingdings" w:hAnsi="Wingdings" w:hint="default"/>
+      </w:rPr>
+    </w:lvl>
+  </w:abstractNum>
+  <w:abstractNum w:abstractNumId="3" w15:restartNumberingAfterBreak="0">
     <w:nsid w:val="575F0F2F"/>
     <w:multiLevelType w:val="multilevel"/>
     <w:tmpl w:val="66BE21F4"/>
@@ -1957,7 +4064,7 @@
       </w:rPr>
     </w:lvl>
   </w:abstractNum>
-  <w:abstractNum w:abstractNumId="3" w15:restartNumberingAfterBreak="0">
+  <w:abstractNum w:abstractNumId="4" w15:restartNumberingAfterBreak="0">
     <w:nsid w:val="64CC42E2"/>
     <w:multiLevelType w:val="multilevel"/>
     <w:tmpl w:val="114265CA"/>
@@ -2106,7 +4213,7 @@
       </w:rPr>
     </w:lvl>
   </w:abstractNum>
-  <w:abstractNum w:abstractNumId="4" w15:restartNumberingAfterBreak="0">
+  <w:abstractNum w:abstractNumId="5" w15:restartNumberingAfterBreak="0">
     <w:nsid w:val="685C6D22"/>
     <w:multiLevelType w:val="multilevel"/>
     <w:tmpl w:val="0CF43768"/>
@@ -2255,7 +4362,7 @@
       </w:rPr>
     </w:lvl>
   </w:abstractNum>
-  <w:abstractNum w:abstractNumId="5" w15:restartNumberingAfterBreak="0">
+  <w:abstractNum w:abstractNumId="6" w15:restartNumberingAfterBreak="0">
     <w:nsid w:val="6BBB3882"/>
     <w:multiLevelType w:val="multilevel"/>
     <w:tmpl w:val="3EF24C8A"/>
@@ -2404,7 +4511,7 @@
       </w:rPr>
     </w:lvl>
   </w:abstractNum>
-  <w:abstractNum w:abstractNumId="6" w15:restartNumberingAfterBreak="0">
+  <w:abstractNum w:abstractNumId="7" w15:restartNumberingAfterBreak="0">
     <w:nsid w:val="6E272B76"/>
     <w:multiLevelType w:val="multilevel"/>
     <w:tmpl w:val="28C801D6"/>
@@ -2553,7 +4660,7 @@
       </w:rPr>
     </w:lvl>
   </w:abstractNum>
-  <w:abstractNum w:abstractNumId="7" w15:restartNumberingAfterBreak="0">
+  <w:abstractNum w:abstractNumId="8" w15:restartNumberingAfterBreak="0">
     <w:nsid w:val="77FD6DE7"/>
     <w:multiLevelType w:val="multilevel"/>
     <w:tmpl w:val="2C7E4C4E"/>
@@ -2706,25 +4813,28 @@
     <w:abstractNumId w:val="0"/>
   </w:num>
   <w:num w:numId="2">
-    <w:abstractNumId w:val="2"/>
+    <w:abstractNumId w:val="3"/>
   </w:num>
   <w:num w:numId="3">
-    <w:abstractNumId w:val="5"/>
+    <w:abstractNumId w:val="6"/>
   </w:num>
   <w:num w:numId="4">
-    <w:abstractNumId w:val="3"/>
+    <w:abstractNumId w:val="4"/>
   </w:num>
   <w:num w:numId="5">
     <w:abstractNumId w:val="1"/>
   </w:num>
   <w:num w:numId="6">
+    <w:abstractNumId w:val="8"/>
+  </w:num>
+  <w:num w:numId="7">
     <w:abstractNumId w:val="7"/>
   </w:num>
-  <w:num w:numId="7">
-    <w:abstractNumId w:val="6"/>
+  <w:num w:numId="8">
+    <w:abstractNumId w:val="5"/>
   </w:num>
-  <w:num w:numId="8">
-    <w:abstractNumId w:val="4"/>
+  <w:num w:numId="9">
+    <w:abstractNumId w:val="2"/>
   </w:num>
 </w:numbering>
 </file>
@@ -3297,6 +5407,42 @@
     <w:basedOn w:val="VarsaylanParagrafYazTipi"/>
     <w:rsid w:val="003C78AE"/>
   </w:style>
+  <w:style w:type="paragraph" w:styleId="ListeParagraf">
+    <w:name w:val="List Paragraph"/>
+    <w:basedOn w:val="Normal"/>
+    <w:uiPriority w:val="34"/>
+    <w:qFormat/>
+    <w:rsid w:val="00CA3F32"/>
+    <w:pPr>
+      <w:ind w:left="720"/>
+      <w:contextualSpacing/>
+    </w:pPr>
+  </w:style>
+  <w:style w:type="paragraph" w:customStyle="1" w:styleId="font-claude-response-body">
+    <w:name w:val="font-claude-response-body"/>
+    <w:basedOn w:val="Normal"/>
+    <w:rsid w:val="00F91124"/>
+    <w:pPr>
+      <w:spacing w:before="100" w:beforeAutospacing="1" w:after="100" w:afterAutospacing="1" w:line="240" w:lineRule="auto"/>
+    </w:pPr>
+    <w:rPr>
+      <w:rFonts w:ascii="Times New Roman" w:eastAsia="Times New Roman" w:hAnsi="Times New Roman" w:cs="Times New Roman"/>
+      <w:sz w:val="24"/>
+      <w:szCs w:val="24"/>
+      <w:lang w:eastAsia="tr-TR"/>
+    </w:rPr>
+  </w:style>
+  <w:style w:type="character" w:styleId="Gl">
+    <w:name w:val="Strong"/>
+    <w:basedOn w:val="VarsaylanParagrafYazTipi"/>
+    <w:uiPriority w:val="22"/>
+    <w:qFormat/>
+    <w:rsid w:val="00F91124"/>
+    <w:rPr>
+      <w:b/>
+      <w:bCs/>
+    </w:rPr>
+  </w:style>
 </w:styles>
 </file>
 

</xml_diff>